<commit_message>
style: tipografía Georgia y Calibri, colores ámbar y logo en los documentos del Sprint 3 (#74)
Co-Authored-By: Claude Opus 5.5 <noreply@anthropic.com>
</commit_message>
<xml_diff>
--- a/docs/Sprint 3/Control_de_Cambios_Sprint3_Los_Primos.docx
+++ b/docs/Sprint 3/Control_de_Cambios_Sprint3_Los_Primos.docx
@@ -2,6 +2,45 @@
 <file path=word/document.xml><?xml version="1.0" encoding="utf-8"?>
 <w:document xmlns:wpc="http://schemas.microsoft.com/office/word/2010/wordprocessingCanvas" xmlns:mc="http://schemas.openxmlformats.org/markup-compatibility/2006" xmlns:o="urn:schemas-microsoft-com:office:office" xmlns:r="http://schemas.openxmlformats.org/officeDocument/2006/relationships" xmlns:m="http://schemas.openxmlformats.org/officeDocument/2006/math" xmlns:v="urn:schemas-microsoft-com:vml" xmlns:wp14="http://schemas.microsoft.com/office/word/2010/wordprocessingDrawing" xmlns:wp="http://schemas.openxmlformats.org/drawingml/2006/wordprocessingDrawing" xmlns:w10="urn:schemas-microsoft-com:office:word" xmlns:w="http://schemas.openxmlformats.org/wordprocessingml/2006/main" xmlns:w14="http://schemas.microsoft.com/office/word/2010/wordml" xmlns:w15="http://schemas.microsoft.com/office/word/2012/wordml" xmlns:wpg="http://schemas.microsoft.com/office/word/2010/wordprocessingGroup" xmlns:wpi="http://schemas.microsoft.com/office/word/2010/wordprocessingInk" xmlns:wne="http://schemas.microsoft.com/office/word/2006/wordml" xmlns:wps="http://schemas.microsoft.com/office/word/2010/wordprocessingShape" xmlns:cx="http://schemas.microsoft.com/office/drawing/2014/chartex" xmlns:cx1="http://schemas.microsoft.com/office/drawing/2015/9/8/chartex" xmlns:cx2="http://schemas.microsoft.com/office/drawing/2015/10/21/chartex" xmlns:cx3="http://schemas.microsoft.com/office/drawing/2016/5/9/chartex" xmlns:cx4="http://schemas.microsoft.com/office/drawing/2016/5/10/chartex" xmlns:cx5="http://schemas.microsoft.com/office/drawing/2016/5/11/chartex" xmlns:cx6="http://schemas.microsoft.com/office/drawing/2016/5/12/chartex" xmlns:cx7="http://schemas.microsoft.com/office/drawing/2016/5/13/chartex" xmlns:cx8="http://schemas.microsoft.com/office/drawing/2016/5/14/chartex" xmlns:aink="http://schemas.microsoft.com/office/drawing/2016/ink" xmlns:am3d="http://schemas.microsoft.com/office/drawing/2017/model3d" xmlns:w16cex="http://schemas.microsoft.com/office/word/2018/wordml/cex" xmlns:w16cid="http://schemas.microsoft.com/office/word/2016/wordml/cid" xmlns:w16="http://schemas.microsoft.com/office/word/2018/wordml" xmlns:w16sdtdh="http://schemas.microsoft.com/office/word/2020/wordml/sdtdatahash" xmlns:w16se="http://schemas.microsoft.com/office/word/2015/wordml/symex" mc:Ignorable="w14 w15 wp14">
   <w:body>
+    <w:p>
+      <w:pPr>
+        <w:spacing w:before="0" w:after="100"/>
+        <w:jc w:val="center"/>
+      </w:pPr>
+      <w:r>
+        <w:drawing>
+          <wp:inline xmlns:wp="http://schemas.openxmlformats.org/drawingml/2006/wordprocessingDrawing" distT="0" distB="0" distL="0" distR="0">
+            <wp:extent cx="720000" cy="720000"/>
+            <wp:docPr id="9001" name="Logo Los Primos" descr="Logo de Mieles Los Primos"/>
+            <a:graphic xmlns:a="http://schemas.openxmlformats.org/drawingml/2006/main">
+              <a:graphicData uri="http://schemas.openxmlformats.org/drawingml/2006/picture">
+                <pic:pic xmlns:pic="http://schemas.openxmlformats.org/drawingml/2006/picture">
+                  <pic:nvPicPr>
+                    <pic:cNvPr id="9001" name="logo.png"/>
+                    <pic:cNvPicPr/>
+                  </pic:nvPicPr>
+                  <pic:blipFill>
+                    <a:blip xmlns:r="http://schemas.openxmlformats.org/officeDocument/2006/relationships" r:embed="rIdLogoLP"/>
+                    <a:stretch>
+                      <a:fillRect/>
+                    </a:stretch>
+                  </pic:blipFill>
+                  <pic:spPr>
+                    <a:xfrm>
+                      <a:off x="0" y="0"/>
+                      <a:ext cx="720000" cy="720000"/>
+                    </a:xfrm>
+                    <a:prstGeom prst="roundRect">
+                      <a:avLst/>
+                    </a:prstGeom>
+                  </pic:spPr>
+                </pic:pic>
+              </a:graphicData>
+            </a:graphic>
+          </wp:inline>
+        </w:drawing>
+      </w:r>
+    </w:p>
     <w:p>
       <w:pPr>
         <w:spacing w:after="40"/>
@@ -9,7 +48,7 @@
       </w:pPr>
       <w:r>
         <w:rPr>
-          <w:rFonts w:ascii="Arial" w:cs="Arial" w:eastAsia="Arial" w:hAnsi="Arial"/>
+          <w:rFonts w:ascii="Calibri" w:cs="Calibri" w:eastAsia="Calibri" w:hAnsi="Calibri"/>
           <w:b/>
           <w:bCs/>
           <w:color w:val="595959"/>
@@ -26,7 +65,7 @@
       </w:pPr>
       <w:r>
         <w:rPr>
-          <w:rFonts w:ascii="Arial" w:cs="Arial" w:eastAsia="Arial" w:hAnsi="Arial"/>
+          <w:rFonts w:ascii="Calibri" w:cs="Calibri" w:eastAsia="Calibri" w:hAnsi="Calibri"/>
           <w:color w:val="595959"/>
           <w:sz w:val="18"/>
           <w:szCs w:val="18"/>
@@ -41,7 +80,7 @@
       </w:pPr>
       <w:r>
         <w:rPr>
-          <w:rFonts w:ascii="Arial" w:cs="Arial" w:eastAsia="Arial" w:hAnsi="Arial"/>
+          <w:rFonts w:ascii="Georgia" w:cs="Georgia" w:eastAsia="Georgia" w:hAnsi="Georgia"/>
           <w:b/>
           <w:bCs/>
           <w:color w:val="8A5A00"/>
@@ -58,7 +97,7 @@
       </w:pPr>
       <w:r>
         <w:rPr>
-          <w:rFonts w:ascii="Arial" w:cs="Arial" w:eastAsia="Arial" w:hAnsi="Arial"/>
+          <w:rFonts w:ascii="Calibri" w:cs="Calibri" w:eastAsia="Calibri" w:hAnsi="Calibri"/>
           <w:b/>
           <w:bCs/>
           <w:color w:val="3B2A00"/>
@@ -75,7 +114,7 @@
       </w:pPr>
       <w:r>
         <w:rPr>
-          <w:rFonts w:ascii="Arial" w:cs="Arial" w:eastAsia="Arial" w:hAnsi="Arial"/>
+          <w:rFonts w:ascii="Calibri" w:cs="Calibri" w:eastAsia="Calibri" w:hAnsi="Calibri"/>
           <w:i/>
           <w:iCs/>
           <w:sz w:val="24"/>
@@ -125,7 +164,7 @@
             </w:pPr>
             <w:r>
               <w:rPr>
-                <w:rFonts w:ascii="Arial" w:cs="Arial" w:eastAsia="Arial" w:hAnsi="Arial"/>
+                <w:rFonts w:ascii="Calibri" w:cs="Calibri" w:eastAsia="Calibri" w:hAnsi="Calibri"/>
                 <w:b/>
                 <w:bCs/>
               </w:rPr>
@@ -156,7 +195,7 @@
             </w:pPr>
             <w:r>
               <w:rPr>
-                <w:rFonts w:ascii="Arial" w:cs="Arial" w:eastAsia="Arial" w:hAnsi="Arial"/>
+                <w:rFonts w:ascii="Calibri" w:cs="Calibri" w:eastAsia="Calibri" w:hAnsi="Calibri"/>
               </w:rPr>
               <w:t xml:space="preserve">Molina Juana – Project Manager / Scrum Master</w:t>
             </w:r>
@@ -188,7 +227,7 @@
             </w:pPr>
             <w:r>
               <w:rPr>
-                <w:rFonts w:ascii="Arial" w:cs="Arial" w:eastAsia="Arial" w:hAnsi="Arial"/>
+                <w:rFonts w:ascii="Calibri" w:cs="Calibri" w:eastAsia="Calibri" w:hAnsi="Calibri"/>
                 <w:b/>
                 <w:bCs/>
               </w:rPr>
@@ -219,7 +258,7 @@
             </w:pPr>
             <w:r>
               <w:rPr>
-                <w:rFonts w:ascii="Arial" w:cs="Arial" w:eastAsia="Arial" w:hAnsi="Arial"/>
+                <w:rFonts w:ascii="Calibri" w:cs="Calibri" w:eastAsia="Calibri" w:hAnsi="Calibri"/>
               </w:rPr>
               <w:t xml:space="preserve">Prof. Erick Gastón Ibáñez</w:t>
             </w:r>
@@ -251,7 +290,7 @@
             </w:pPr>
             <w:r>
               <w:rPr>
-                <w:rFonts w:ascii="Arial" w:cs="Arial" w:eastAsia="Arial" w:hAnsi="Arial"/>
+                <w:rFonts w:ascii="Calibri" w:cs="Calibri" w:eastAsia="Calibri" w:hAnsi="Calibri"/>
                 <w:b/>
                 <w:bCs/>
               </w:rPr>
@@ -282,7 +321,7 @@
             </w:pPr>
             <w:r>
               <w:rPr>
-                <w:rFonts w:ascii="Arial" w:cs="Arial" w:eastAsia="Arial" w:hAnsi="Arial"/>
+                <w:rFonts w:ascii="Calibri" w:cs="Calibri" w:eastAsia="Calibri" w:hAnsi="Calibri"/>
               </w:rPr>
               <w:t xml:space="preserve">22 de octubre de 2026 · Versión 1.1 (agrega la CR-05)</w:t>
             </w:r>
@@ -314,7 +353,7 @@
             </w:pPr>
             <w:r>
               <w:rPr>
-                <w:rFonts w:ascii="Arial" w:cs="Arial" w:eastAsia="Arial" w:hAnsi="Arial"/>
+                <w:rFonts w:ascii="Calibri" w:cs="Calibri" w:eastAsia="Calibri" w:hAnsi="Calibri"/>
                 <w:b/>
                 <w:bCs/>
               </w:rPr>
@@ -345,7 +384,7 @@
             </w:pPr>
             <w:r>
               <w:rPr>
-                <w:rFonts w:ascii="Arial" w:cs="Arial" w:eastAsia="Arial" w:hAnsi="Arial"/>
+                <w:rFonts w:ascii="Calibri" w:cs="Calibri" w:eastAsia="Calibri" w:hAnsi="Calibri"/>
               </w:rPr>
               <w:t xml:space="preserve">Acta de Constitución del 25/08/2026 y consigna del Sprint 3 (entrega final: 23/10/2026)</w:t>
             </w:r>
@@ -364,7 +403,7 @@
       </w:pPr>
       <w:r>
         <w:rPr>
-          <w:rFonts w:ascii="Arial" w:cs="Arial" w:eastAsia="Arial" w:hAnsi="Arial"/>
+          <w:rFonts w:ascii="Georgia" w:cs="Georgia" w:eastAsia="Georgia" w:hAnsi="Georgia"/>
         </w:rPr>
         <w:t xml:space="preserve">1. QUÉ ES UNA SOLICITUD DE CAMBIO Y POR QUÉ SE CONTROLA</w:t>
       </w:r>
@@ -376,13 +415,13 @@
       </w:pPr>
       <w:r>
         <w:rPr>
-          <w:rFonts w:ascii="Arial" w:cs="Arial" w:eastAsia="Arial" w:hAnsi="Arial"/>
+          <w:rFonts w:ascii="Calibri" w:cs="Calibri" w:eastAsia="Calibri" w:hAnsi="Calibri"/>
         </w:rPr>
         <w:t xml:space="preserve">Una </w:t>
       </w:r>
       <w:r>
         <w:rPr>
-          <w:rFonts w:ascii="Arial" w:cs="Arial" w:eastAsia="Arial" w:hAnsi="Arial"/>
+          <w:rFonts w:ascii="Calibri" w:cs="Calibri" w:eastAsia="Calibri" w:hAnsi="Calibri"/>
           <w:b/>
           <w:bCs/>
         </w:rPr>
@@ -390,7 +429,7 @@
       </w:r>
       <w:r>
         <w:rPr>
-          <w:rFonts w:ascii="Arial" w:cs="Arial" w:eastAsia="Arial" w:hAnsi="Arial"/>
+          <w:rFonts w:ascii="Calibri" w:cs="Calibri" w:eastAsia="Calibri" w:hAnsi="Calibri"/>
         </w:rPr>
         <w:t xml:space="preserve"> (Change Request, CR) es el pedido formal de modificar algo que ya estaba acordado en la línea base del proyecto: el alcance, el cronograma, el costo, la calidad o la forma técnica de resolver un entregable. Según los estándares del PMI, ningún cambio se incorpora de manera informal: primero se registra, luego se evalúa su impacto y recién después se decide si se aprueba, se rechaza o se posterga.</w:t>
       </w:r>
@@ -402,13 +441,13 @@
       </w:pPr>
       <w:r>
         <w:rPr>
-          <w:rFonts w:ascii="Arial" w:cs="Arial" w:eastAsia="Arial" w:hAnsi="Arial"/>
+          <w:rFonts w:ascii="Calibri" w:cs="Calibri" w:eastAsia="Calibri" w:hAnsi="Calibri"/>
         </w:rPr>
         <w:t xml:space="preserve">En este proyecto el control es especialmente necesario por tres restricciones del Acta de Constitución: la </w:t>
       </w:r>
       <w:r>
         <w:rPr>
-          <w:rFonts w:ascii="Arial" w:cs="Arial" w:eastAsia="Arial" w:hAnsi="Arial"/>
+          <w:rFonts w:ascii="Calibri" w:cs="Calibri" w:eastAsia="Calibri" w:hAnsi="Calibri"/>
           <w:b/>
           <w:bCs/>
         </w:rPr>
@@ -416,13 +455,13 @@
       </w:r>
       <w:r>
         <w:rPr>
-          <w:rFonts w:ascii="Arial" w:cs="Arial" w:eastAsia="Arial" w:hAnsi="Arial"/>
+          <w:rFonts w:ascii="Calibri" w:cs="Calibri" w:eastAsia="Calibri" w:hAnsi="Calibri"/>
         </w:rPr>
         <w:t xml:space="preserve">, el </w:t>
       </w:r>
       <w:r>
         <w:rPr>
-          <w:rFonts w:ascii="Arial" w:cs="Arial" w:eastAsia="Arial" w:hAnsi="Arial"/>
+          <w:rFonts w:ascii="Calibri" w:cs="Calibri" w:eastAsia="Calibri" w:hAnsi="Calibri"/>
           <w:b/>
           <w:bCs/>
         </w:rPr>
@@ -430,13 +469,13 @@
       </w:r>
       <w:r>
         <w:rPr>
-          <w:rFonts w:ascii="Arial" w:cs="Arial" w:eastAsia="Arial" w:hAnsi="Arial"/>
+          <w:rFonts w:ascii="Calibri" w:cs="Calibri" w:eastAsia="Calibri" w:hAnsi="Calibri"/>
         </w:rPr>
         <w:t xml:space="preserve"> y el </w:t>
       </w:r>
       <w:r>
         <w:rPr>
-          <w:rFonts w:ascii="Arial" w:cs="Arial" w:eastAsia="Arial" w:hAnsi="Arial"/>
+          <w:rFonts w:ascii="Calibri" w:cs="Calibri" w:eastAsia="Calibri" w:hAnsi="Calibri"/>
           <w:b/>
           <w:bCs/>
         </w:rPr>
@@ -444,7 +483,7 @@
       </w:r>
       <w:r>
         <w:rPr>
-          <w:rFonts w:ascii="Arial" w:cs="Arial" w:eastAsia="Arial" w:hAnsi="Arial"/>
+          <w:rFonts w:ascii="Calibri" w:cs="Calibri" w:eastAsia="Calibri" w:hAnsi="Calibri"/>
         </w:rPr>
         <w:t xml:space="preserve">, donde una funcionalidad extra compite directamente por las mismas horas de trabajo. Durante el Sprint 3 aparecen cambios por exigencias legales, por ajustes técnicos y por decisiones de alcance, y este documento los registra y gestiona.</w:t>
       </w:r>
@@ -460,7 +499,7 @@
       </w:pPr>
       <w:r>
         <w:rPr>
-          <w:rFonts w:ascii="Arial" w:cs="Arial" w:eastAsia="Arial" w:hAnsi="Arial"/>
+          <w:rFonts w:ascii="Georgia" w:cs="Georgia" w:eastAsia="Georgia" w:hAnsi="Georgia"/>
         </w:rPr>
         <w:t xml:space="preserve">2. PROCEDIMIENTO DE CONTROL DE CAMBIOS</w:t>
       </w:r>
@@ -477,7 +516,7 @@
       </w:pPr>
       <w:r>
         <w:rPr>
-          <w:rFonts w:ascii="Arial" w:cs="Arial" w:eastAsia="Arial" w:hAnsi="Arial"/>
+          <w:rFonts w:ascii="Calibri" w:cs="Calibri" w:eastAsia="Calibri" w:hAnsi="Calibri"/>
           <w:b/>
           <w:bCs/>
         </w:rPr>
@@ -485,7 +524,7 @@
       </w:r>
       <w:r>
         <w:rPr>
-          <w:rFonts w:ascii="Arial" w:cs="Arial" w:eastAsia="Arial" w:hAnsi="Arial"/>
+          <w:rFonts w:ascii="Calibri" w:cs="Calibri" w:eastAsia="Calibri" w:hAnsi="Calibri"/>
         </w:rPr>
         <w:t xml:space="preserve"> Cualquier cambio se anota en el formulario de la sección 3 y recibe un número correlativo (CR-01, CR-02…).</w:t>
       </w:r>
@@ -502,7 +541,7 @@
       </w:pPr>
       <w:r>
         <w:rPr>
-          <w:rFonts w:ascii="Arial" w:cs="Arial" w:eastAsia="Arial" w:hAnsi="Arial"/>
+          <w:rFonts w:ascii="Calibri" w:cs="Calibri" w:eastAsia="Calibri" w:hAnsi="Calibri"/>
           <w:b/>
           <w:bCs/>
         </w:rPr>
@@ -510,7 +549,7 @@
       </w:r>
       <w:r>
         <w:rPr>
-          <w:rFonts w:ascii="Arial" w:cs="Arial" w:eastAsia="Arial" w:hAnsi="Arial"/>
+          <w:rFonts w:ascii="Calibri" w:cs="Calibri" w:eastAsia="Calibri" w:hAnsi="Calibri"/>
         </w:rPr>
         <w:t xml:space="preserve"> Se analiza el efecto sobre el alcance, el tiempo (horas y fecha de entrega), el costo simulado, los riesgos, la calidad y el cumplimiento legal.</w:t>
       </w:r>
@@ -527,7 +566,7 @@
       </w:pPr>
       <w:r>
         <w:rPr>
-          <w:rFonts w:ascii="Arial" w:cs="Arial" w:eastAsia="Arial" w:hAnsi="Arial"/>
+          <w:rFonts w:ascii="Calibri" w:cs="Calibri" w:eastAsia="Calibri" w:hAnsi="Calibri"/>
           <w:b/>
           <w:bCs/>
         </w:rPr>
@@ -535,7 +574,7 @@
       </w:r>
       <w:r>
         <w:rPr>
-          <w:rFonts w:ascii="Arial" w:cs="Arial" w:eastAsia="Arial" w:hAnsi="Arial"/>
+          <w:rFonts w:ascii="Calibri" w:cs="Calibri" w:eastAsia="Calibri" w:hAnsi="Calibri"/>
         </w:rPr>
         <w:t xml:space="preserve"> Se resuelve según la matriz de autoridad (sección 2.2): aprobar, rechazar o diferir a un sprint posterior.</w:t>
       </w:r>
@@ -552,7 +591,7 @@
       </w:pPr>
       <w:r>
         <w:rPr>
-          <w:rFonts w:ascii="Arial" w:cs="Arial" w:eastAsia="Arial" w:hAnsi="Arial"/>
+          <w:rFonts w:ascii="Calibri" w:cs="Calibri" w:eastAsia="Calibri" w:hAnsi="Calibri"/>
           <w:b/>
           <w:bCs/>
         </w:rPr>
@@ -560,7 +599,7 @@
       </w:r>
       <w:r>
         <w:rPr>
-          <w:rFonts w:ascii="Arial" w:cs="Arial" w:eastAsia="Arial" w:hAnsi="Arial"/>
+          <w:rFonts w:ascii="Calibri" w:cs="Calibri" w:eastAsia="Calibri" w:hAnsi="Calibri"/>
         </w:rPr>
         <w:t xml:space="preserve"> Si se aprueba, se actualiza el tablero Kanban (nueva tarjeta con responsable y fecha), el Gantt y la matriz de riesgos.</w:t>
       </w:r>
@@ -577,7 +616,7 @@
       </w:pPr>
       <w:r>
         <w:rPr>
-          <w:rFonts w:ascii="Arial" w:cs="Arial" w:eastAsia="Arial" w:hAnsi="Arial"/>
+          <w:rFonts w:ascii="Calibri" w:cs="Calibri" w:eastAsia="Calibri" w:hAnsi="Calibri"/>
           <w:b/>
           <w:bCs/>
         </w:rPr>
@@ -585,7 +624,7 @@
       </w:r>
       <w:r>
         <w:rPr>
-          <w:rFonts w:ascii="Arial" w:cs="Arial" w:eastAsia="Arial" w:hAnsi="Arial"/>
+          <w:rFonts w:ascii="Calibri" w:cs="Calibri" w:eastAsia="Calibri" w:hAnsi="Calibri"/>
         </w:rPr>
         <w:t xml:space="preserve"> El cambio se desarrolla en su propia rama y se comprueba con los casos de prueba del plan de pruebas.</w:t>
       </w:r>
@@ -602,7 +641,7 @@
       </w:pPr>
       <w:r>
         <w:rPr>
-          <w:rFonts w:ascii="Arial" w:cs="Arial" w:eastAsia="Arial" w:hAnsi="Arial"/>
+          <w:rFonts w:ascii="Calibri" w:cs="Calibri" w:eastAsia="Calibri" w:hAnsi="Calibri"/>
           <w:b/>
           <w:bCs/>
         </w:rPr>
@@ -610,7 +649,7 @@
       </w:r>
       <w:r>
         <w:rPr>
-          <w:rFonts w:ascii="Arial" w:cs="Arial" w:eastAsia="Arial" w:hAnsi="Arial"/>
+          <w:rFonts w:ascii="Calibri" w:cs="Calibri" w:eastAsia="Calibri" w:hAnsi="Calibri"/>
         </w:rPr>
         <w:t xml:space="preserve"> Se marca el estado final y se informa al docente en la revisión semanal.</w:t>
       </w:r>
@@ -623,7 +662,7 @@
       </w:pPr>
       <w:r>
         <w:rPr>
-          <w:rFonts w:ascii="Arial" w:cs="Arial" w:eastAsia="Arial" w:hAnsi="Arial"/>
+          <w:rFonts w:ascii="Georgia" w:cs="Georgia" w:eastAsia="Georgia" w:hAnsi="Georgia"/>
         </w:rPr>
         <w:t xml:space="preserve">2.1 Criterios de decisión</w:t>
       </w:r>
@@ -640,13 +679,13 @@
       </w:pPr>
       <w:r>
         <w:rPr>
-          <w:rFonts w:ascii="Arial" w:cs="Arial" w:eastAsia="Arial" w:hAnsi="Arial"/>
+          <w:rFonts w:ascii="Calibri" w:cs="Calibri" w:eastAsia="Calibri" w:hAnsi="Calibri"/>
         </w:rPr>
         <w:t xml:space="preserve">Se </w:t>
       </w:r>
       <w:r>
         <w:rPr>
-          <w:rFonts w:ascii="Arial" w:cs="Arial" w:eastAsia="Arial" w:hAnsi="Arial"/>
+          <w:rFonts w:ascii="Calibri" w:cs="Calibri" w:eastAsia="Calibri" w:hAnsi="Calibri"/>
           <w:b/>
           <w:bCs/>
         </w:rPr>
@@ -654,7 +693,7 @@
       </w:r>
       <w:r>
         <w:rPr>
-          <w:rFonts w:ascii="Arial" w:cs="Arial" w:eastAsia="Arial" w:hAnsi="Arial"/>
+          <w:rFonts w:ascii="Calibri" w:cs="Calibri" w:eastAsia="Calibri" w:hAnsi="Calibri"/>
         </w:rPr>
         <w:t xml:space="preserve"> si es obligatorio por ley o por la consigna, o si aporta valor con un impacto absorbible sin mover la fecha de entrega.</w:t>
       </w:r>
@@ -671,13 +710,13 @@
       </w:pPr>
       <w:r>
         <w:rPr>
-          <w:rFonts w:ascii="Arial" w:cs="Arial" w:eastAsia="Arial" w:hAnsi="Arial"/>
+          <w:rFonts w:ascii="Calibri" w:cs="Calibri" w:eastAsia="Calibri" w:hAnsi="Calibri"/>
         </w:rPr>
         <w:t xml:space="preserve">Se </w:t>
       </w:r>
       <w:r>
         <w:rPr>
-          <w:rFonts w:ascii="Arial" w:cs="Arial" w:eastAsia="Arial" w:hAnsi="Arial"/>
+          <w:rFonts w:ascii="Calibri" w:cs="Calibri" w:eastAsia="Calibri" w:hAnsi="Calibri"/>
           <w:b/>
           <w:bCs/>
         </w:rPr>
@@ -685,7 +724,7 @@
       </w:r>
       <w:r>
         <w:rPr>
-          <w:rFonts w:ascii="Arial" w:cs="Arial" w:eastAsia="Arial" w:hAnsi="Arial"/>
+          <w:rFonts w:ascii="Calibri" w:cs="Calibri" w:eastAsia="Calibri" w:hAnsi="Calibri"/>
         </w:rPr>
         <w:t xml:space="preserve"> si es valioso pero su costo en horas pondría en riesgo la entrega del 23/10; pasa a la planificación del Sprint 4.</w:t>
       </w:r>
@@ -702,13 +741,13 @@
       </w:pPr>
       <w:r>
         <w:rPr>
-          <w:rFonts w:ascii="Arial" w:cs="Arial" w:eastAsia="Arial" w:hAnsi="Arial"/>
+          <w:rFonts w:ascii="Calibri" w:cs="Calibri" w:eastAsia="Calibri" w:hAnsi="Calibri"/>
         </w:rPr>
         <w:t xml:space="preserve">Se </w:t>
       </w:r>
       <w:r>
         <w:rPr>
-          <w:rFonts w:ascii="Arial" w:cs="Arial" w:eastAsia="Arial" w:hAnsi="Arial"/>
+          <w:rFonts w:ascii="Calibri" w:cs="Calibri" w:eastAsia="Calibri" w:hAnsi="Calibri"/>
           <w:b/>
           <w:bCs/>
         </w:rPr>
@@ -716,7 +755,7 @@
       </w:r>
       <w:r>
         <w:rPr>
-          <w:rFonts w:ascii="Arial" w:cs="Arial" w:eastAsia="Arial" w:hAnsi="Arial"/>
+          <w:rFonts w:ascii="Calibri" w:cs="Calibri" w:eastAsia="Calibri" w:hAnsi="Calibri"/>
         </w:rPr>
         <w:t xml:space="preserve"> si no aporta a los objetivos SMART del Acta o si su impacto no puede compensarse.</w:t>
       </w:r>
@@ -729,7 +768,7 @@
       </w:pPr>
       <w:r>
         <w:rPr>
-          <w:rFonts w:ascii="Arial" w:cs="Arial" w:eastAsia="Arial" w:hAnsi="Arial"/>
+          <w:rFonts w:ascii="Georgia" w:cs="Georgia" w:eastAsia="Georgia" w:hAnsi="Georgia"/>
         </w:rPr>
         <w:t xml:space="preserve">2.2 Matriz de autoridad</w:t>
       </w:r>
@@ -742,7 +781,7 @@
       </w:pPr>
       <w:r>
         <w:rPr>
-          <w:rFonts w:ascii="Arial" w:cs="Arial" w:eastAsia="Arial" w:hAnsi="Arial"/>
+          <w:rFonts w:ascii="Calibri" w:cs="Calibri" w:eastAsia="Calibri" w:hAnsi="Calibri"/>
         </w:rPr>
         <w:t xml:space="preserve">Se aplica la distribución de autoridad definida en el Acta de Constitución:</w:t>
       </w:r>
@@ -792,7 +831,7 @@
             </w:pPr>
             <w:r>
               <w:rPr>
-                <w:rFonts w:ascii="Arial" w:cs="Arial" w:eastAsia="Arial" w:hAnsi="Arial"/>
+                <w:rFonts w:ascii="Calibri" w:cs="Calibri" w:eastAsia="Calibri" w:hAnsi="Calibri"/>
                 <w:b/>
                 <w:bCs/>
               </w:rPr>
@@ -824,7 +863,7 @@
             </w:pPr>
             <w:r>
               <w:rPr>
-                <w:rFonts w:ascii="Arial" w:cs="Arial" w:eastAsia="Arial" w:hAnsi="Arial"/>
+                <w:rFonts w:ascii="Calibri" w:cs="Calibri" w:eastAsia="Calibri" w:hAnsi="Calibri"/>
                 <w:b/>
                 <w:bCs/>
               </w:rPr>
@@ -856,7 +895,7 @@
             </w:pPr>
             <w:r>
               <w:rPr>
-                <w:rFonts w:ascii="Arial" w:cs="Arial" w:eastAsia="Arial" w:hAnsi="Arial"/>
+                <w:rFonts w:ascii="Calibri" w:cs="Calibri" w:eastAsia="Calibri" w:hAnsi="Calibri"/>
                 <w:b/>
                 <w:bCs/>
               </w:rPr>
@@ -892,7 +931,7 @@
             </w:pPr>
             <w:r>
               <w:rPr>
-                <w:rFonts w:ascii="Arial" w:cs="Arial" w:eastAsia="Arial" w:hAnsi="Arial"/>
+                <w:rFonts w:ascii="Calibri" w:cs="Calibri" w:eastAsia="Calibri" w:hAnsi="Calibri"/>
               </w:rPr>
               <w:t xml:space="preserve">Prioridad de tareas, herramientas y diseño técnico del código</w:t>
             </w:r>
@@ -921,7 +960,7 @@
             </w:pPr>
             <w:r>
               <w:rPr>
-                <w:rFonts w:ascii="Arial" w:cs="Arial" w:eastAsia="Arial" w:hAnsi="Arial"/>
+                <w:rFonts w:ascii="Calibri" w:cs="Calibri" w:eastAsia="Calibri" w:hAnsi="Calibri"/>
               </w:rPr>
               <w:t xml:space="preserve">Project Manager (decisión autónoma)</w:t>
             </w:r>
@@ -950,7 +989,7 @@
             </w:pPr>
             <w:r>
               <w:rPr>
-                <w:rFonts w:ascii="Arial" w:cs="Arial" w:eastAsia="Arial" w:hAnsi="Arial"/>
+                <w:rFonts w:ascii="Calibri" w:cs="Calibri" w:eastAsia="Calibri" w:hAnsi="Calibri"/>
               </w:rPr>
               <w:t xml:space="preserve">Pasar el código a módulos ES</w:t>
             </w:r>
@@ -984,7 +1023,7 @@
             </w:pPr>
             <w:r>
               <w:rPr>
-                <w:rFonts w:ascii="Arial" w:cs="Arial" w:eastAsia="Arial" w:hAnsi="Arial"/>
+                <w:rFonts w:ascii="Calibri" w:cs="Calibri" w:eastAsia="Calibri" w:hAnsi="Calibri"/>
               </w:rPr>
               <w:t xml:space="preserve">Cambio sustancial del alcance del entregable</w:t>
             </w:r>
@@ -1013,7 +1052,7 @@
             </w:pPr>
             <w:r>
               <w:rPr>
-                <w:rFonts w:ascii="Arial" w:cs="Arial" w:eastAsia="Arial" w:hAnsi="Arial"/>
+                <w:rFonts w:ascii="Calibri" w:cs="Calibri" w:eastAsia="Calibri" w:hAnsi="Calibri"/>
               </w:rPr>
               <w:t xml:space="preserve">Docente / Cliente (aprobación)</w:t>
             </w:r>
@@ -1042,7 +1081,7 @@
             </w:pPr>
             <w:r>
               <w:rPr>
-                <w:rFonts w:ascii="Arial" w:cs="Arial" w:eastAsia="Arial" w:hAnsi="Arial"/>
+                <w:rFonts w:ascii="Calibri" w:cs="Calibri" w:eastAsia="Calibri" w:hAnsi="Calibri"/>
               </w:rPr>
               <w:t xml:space="preserve">Quitar el backend y el pago real del alcance</w:t>
             </w:r>
@@ -1076,7 +1115,7 @@
             </w:pPr>
             <w:r>
               <w:rPr>
-                <w:rFonts w:ascii="Arial" w:cs="Arial" w:eastAsia="Arial" w:hAnsi="Arial"/>
+                <w:rFonts w:ascii="Calibri" w:cs="Calibri" w:eastAsia="Calibri" w:hAnsi="Calibri"/>
               </w:rPr>
               <w:t xml:space="preserve">Modificación de fechas límite institucionales</w:t>
             </w:r>
@@ -1105,7 +1144,7 @@
             </w:pPr>
             <w:r>
               <w:rPr>
-                <w:rFonts w:ascii="Arial" w:cs="Arial" w:eastAsia="Arial" w:hAnsi="Arial"/>
+                <w:rFonts w:ascii="Calibri" w:cs="Calibri" w:eastAsia="Calibri" w:hAnsi="Calibri"/>
               </w:rPr>
               <w:t xml:space="preserve">Docente (aprobación)</w:t>
             </w:r>
@@ -1134,7 +1173,7 @@
             </w:pPr>
             <w:r>
               <w:rPr>
-                <w:rFonts w:ascii="Arial" w:cs="Arial" w:eastAsia="Arial" w:hAnsi="Arial"/>
+                <w:rFonts w:ascii="Calibri" w:cs="Calibri" w:eastAsia="Calibri" w:hAnsi="Calibri"/>
               </w:rPr>
               <w:t xml:space="preserve">Mover la entrega del 23/10</w:t>
             </w:r>
@@ -1168,7 +1207,7 @@
             </w:pPr>
             <w:r>
               <w:rPr>
-                <w:rFonts w:ascii="Arial" w:cs="Arial" w:eastAsia="Arial" w:hAnsi="Arial"/>
+                <w:rFonts w:ascii="Calibri" w:cs="Calibri" w:eastAsia="Calibri" w:hAnsi="Calibri"/>
               </w:rPr>
               <w:t xml:space="preserve">Requisito legal obligatorio no previsto</w:t>
             </w:r>
@@ -1197,7 +1236,7 @@
             </w:pPr>
             <w:r>
               <w:rPr>
-                <w:rFonts w:ascii="Arial" w:cs="Arial" w:eastAsia="Arial" w:hAnsi="Arial"/>
+                <w:rFonts w:ascii="Calibri" w:cs="Calibri" w:eastAsia="Calibri" w:hAnsi="Calibri"/>
               </w:rPr>
               <w:t xml:space="preserve">Project Manager, con aviso al docente</w:t>
             </w:r>
@@ -1226,7 +1265,7 @@
             </w:pPr>
             <w:r>
               <w:rPr>
-                <w:rFonts w:ascii="Arial" w:cs="Arial" w:eastAsia="Arial" w:hAnsi="Arial"/>
+                <w:rFonts w:ascii="Calibri" w:cs="Calibri" w:eastAsia="Calibri" w:hAnsi="Calibri"/>
               </w:rPr>
               <w:t xml:space="preserve">Botón de Arrepentimiento</w:t>
             </w:r>
@@ -1245,7 +1284,7 @@
       </w:pPr>
       <w:r>
         <w:rPr>
-          <w:rFonts w:ascii="Arial" w:cs="Arial" w:eastAsia="Arial" w:hAnsi="Arial"/>
+          <w:rFonts w:ascii="Georgia" w:cs="Georgia" w:eastAsia="Georgia" w:hAnsi="Georgia"/>
         </w:rPr>
         <w:t xml:space="preserve">3. FORMULARIO DE SOLICITUD DE CAMBIO (PLANTILLA)</w:t>
       </w:r>
@@ -1257,7 +1296,7 @@
       </w:pPr>
       <w:r>
         <w:rPr>
-          <w:rFonts w:ascii="Arial" w:cs="Arial" w:eastAsia="Arial" w:hAnsi="Arial"/>
+          <w:rFonts w:ascii="Calibri" w:cs="Calibri" w:eastAsia="Calibri" w:hAnsi="Calibri"/>
         </w:rPr>
         <w:t xml:space="preserve">Formato reutilizable para registrar nuevos cambios durante el resto del proyecto.</w:t>
       </w:r>
@@ -1306,7 +1345,7 @@
             </w:pPr>
             <w:r>
               <w:rPr>
-                <w:rFonts w:ascii="Arial" w:cs="Arial" w:eastAsia="Arial" w:hAnsi="Arial"/>
+                <w:rFonts w:ascii="Calibri" w:cs="Calibri" w:eastAsia="Calibri" w:hAnsi="Calibri"/>
                 <w:b/>
                 <w:bCs/>
               </w:rPr>
@@ -1337,7 +1376,7 @@
             </w:pPr>
             <w:r>
               <w:rPr>
-                <w:rFonts w:ascii="Arial" w:cs="Arial" w:eastAsia="Arial" w:hAnsi="Arial"/>
+                <w:rFonts w:ascii="Calibri" w:cs="Calibri" w:eastAsia="Calibri" w:hAnsi="Calibri"/>
               </w:rPr>
               <w:t xml:space="preserve">CR-__ · </w:t>
             </w:r>
@@ -1372,7 +1411,7 @@
             </w:pPr>
             <w:r>
               <w:rPr>
-                <w:rFonts w:ascii="Arial" w:cs="Arial" w:eastAsia="Arial" w:hAnsi="Arial"/>
+                <w:rFonts w:ascii="Calibri" w:cs="Calibri" w:eastAsia="Calibri" w:hAnsi="Calibri"/>
                 <w:b/>
                 <w:bCs/>
               </w:rPr>
@@ -1432,7 +1471,7 @@
             </w:pPr>
             <w:r>
               <w:rPr>
-                <w:rFonts w:ascii="Arial" w:cs="Arial" w:eastAsia="Arial" w:hAnsi="Arial"/>
+                <w:rFonts w:ascii="Calibri" w:cs="Calibri" w:eastAsia="Calibri" w:hAnsi="Calibri"/>
                 <w:b/>
                 <w:bCs/>
               </w:rPr>
@@ -1463,7 +1502,7 @@
             </w:pPr>
             <w:r>
               <w:rPr>
-                <w:rFonts w:ascii="Arial" w:cs="Arial" w:eastAsia="Arial" w:hAnsi="Arial"/>
+                <w:rFonts w:ascii="Calibri" w:cs="Calibri" w:eastAsia="Calibri" w:hAnsi="Calibri"/>
               </w:rPr>
               <w:t xml:space="preserve">Alcance / Cronograma / Costo / Técnico / Legal</w:t>
             </w:r>
@@ -1498,7 +1537,7 @@
             </w:pPr>
             <w:r>
               <w:rPr>
-                <w:rFonts w:ascii="Arial" w:cs="Arial" w:eastAsia="Arial" w:hAnsi="Arial"/>
+                <w:rFonts w:ascii="Calibri" w:cs="Calibri" w:eastAsia="Calibri" w:hAnsi="Calibri"/>
                 <w:b/>
                 <w:bCs/>
               </w:rPr>
@@ -1558,7 +1597,7 @@
             </w:pPr>
             <w:r>
               <w:rPr>
-                <w:rFonts w:ascii="Arial" w:cs="Arial" w:eastAsia="Arial" w:hAnsi="Arial"/>
+                <w:rFonts w:ascii="Calibri" w:cs="Calibri" w:eastAsia="Calibri" w:hAnsi="Calibri"/>
                 <w:b/>
                 <w:bCs/>
               </w:rPr>
@@ -1618,7 +1657,7 @@
             </w:pPr>
             <w:r>
               <w:rPr>
-                <w:rFonts w:ascii="Arial" w:cs="Arial" w:eastAsia="Arial" w:hAnsi="Arial"/>
+                <w:rFonts w:ascii="Calibri" w:cs="Calibri" w:eastAsia="Calibri" w:hAnsi="Calibri"/>
                 <w:b/>
                 <w:bCs/>
               </w:rPr>
@@ -1649,7 +1688,7 @@
             </w:pPr>
             <w:r>
               <w:rPr>
-                <w:rFonts w:ascii="Arial" w:cs="Arial" w:eastAsia="Arial" w:hAnsi="Arial"/>
+                <w:rFonts w:ascii="Calibri" w:cs="Calibri" w:eastAsia="Calibri" w:hAnsi="Calibri"/>
               </w:rPr>
               <w:t xml:space="preserve">Horas adicionales o ahorradas · Efecto sobre la fecha de entrega</w:t>
             </w:r>
@@ -1684,7 +1723,7 @@
             </w:pPr>
             <w:r>
               <w:rPr>
-                <w:rFonts w:ascii="Arial" w:cs="Arial" w:eastAsia="Arial" w:hAnsi="Arial"/>
+                <w:rFonts w:ascii="Calibri" w:cs="Calibri" w:eastAsia="Calibri" w:hAnsi="Calibri"/>
                 <w:b/>
                 <w:bCs/>
               </w:rPr>
@@ -1715,7 +1754,7 @@
             </w:pPr>
             <w:r>
               <w:rPr>
-                <w:rFonts w:ascii="Arial" w:cs="Arial" w:eastAsia="Arial" w:hAnsi="Arial"/>
+                <w:rFonts w:ascii="Calibri" w:cs="Calibri" w:eastAsia="Calibri" w:hAnsi="Calibri"/>
               </w:rPr>
               <w:t xml:space="preserve">Horas × $ 2.500</w:t>
             </w:r>
@@ -1750,7 +1789,7 @@
             </w:pPr>
             <w:r>
               <w:rPr>
-                <w:rFonts w:ascii="Arial" w:cs="Arial" w:eastAsia="Arial" w:hAnsi="Arial"/>
+                <w:rFonts w:ascii="Calibri" w:cs="Calibri" w:eastAsia="Calibri" w:hAnsi="Calibri"/>
                 <w:b/>
                 <w:bCs/>
               </w:rPr>
@@ -1810,7 +1849,7 @@
             </w:pPr>
             <w:r>
               <w:rPr>
-                <w:rFonts w:ascii="Arial" w:cs="Arial" w:eastAsia="Arial" w:hAnsi="Arial"/>
+                <w:rFonts w:ascii="Calibri" w:cs="Calibri" w:eastAsia="Calibri" w:hAnsi="Calibri"/>
                 <w:b/>
                 <w:bCs/>
               </w:rPr>
@@ -1841,7 +1880,7 @@
             </w:pPr>
             <w:r>
               <w:rPr>
-                <w:rFonts w:ascii="Arial" w:cs="Arial" w:eastAsia="Arial" w:hAnsi="Arial"/>
+                <w:rFonts w:ascii="Calibri" w:cs="Calibri" w:eastAsia="Calibri" w:hAnsi="Calibri"/>
               </w:rPr>
               <w:t xml:space="preserve">Aprobada / Rechazada / Diferida · Quién decide · Fecha</w:t>
             </w:r>
@@ -1876,7 +1915,7 @@
             </w:pPr>
             <w:r>
               <w:rPr>
-                <w:rFonts w:ascii="Arial" w:cs="Arial" w:eastAsia="Arial" w:hAnsi="Arial"/>
+                <w:rFonts w:ascii="Calibri" w:cs="Calibri" w:eastAsia="Calibri" w:hAnsi="Calibri"/>
                 <w:b/>
                 <w:bCs/>
               </w:rPr>
@@ -1907,7 +1946,7 @@
             </w:pPr>
             <w:r>
               <w:rPr>
-                <w:rFonts w:ascii="Arial" w:cs="Arial" w:eastAsia="Arial" w:hAnsi="Arial"/>
+                <w:rFonts w:ascii="Calibri" w:cs="Calibri" w:eastAsia="Calibri" w:hAnsi="Calibri"/>
               </w:rPr>
               <w:t xml:space="preserve">Qué se reprioriza para no mover la fecha</w:t>
             </w:r>
@@ -1926,7 +1965,7 @@
       </w:pPr>
       <w:r>
         <w:rPr>
-          <w:rFonts w:ascii="Arial" w:cs="Arial" w:eastAsia="Arial" w:hAnsi="Arial"/>
+          <w:rFonts w:ascii="Georgia" w:cs="Georgia" w:eastAsia="Georgia" w:hAnsi="Georgia"/>
         </w:rPr>
         <w:t xml:space="preserve">4. REGISTRO DE CAMBIOS DEL SPRINT 3</w:t>
       </w:r>
@@ -1978,7 +2017,7 @@
             </w:pPr>
             <w:r>
               <w:rPr>
-                <w:rFonts w:ascii="Arial" w:cs="Arial" w:eastAsia="Arial" w:hAnsi="Arial"/>
+                <w:rFonts w:ascii="Calibri" w:cs="Calibri" w:eastAsia="Calibri" w:hAnsi="Calibri"/>
                 <w:b/>
                 <w:bCs/>
               </w:rPr>
@@ -2010,7 +2049,7 @@
             </w:pPr>
             <w:r>
               <w:rPr>
-                <w:rFonts w:ascii="Arial" w:cs="Arial" w:eastAsia="Arial" w:hAnsi="Arial"/>
+                <w:rFonts w:ascii="Calibri" w:cs="Calibri" w:eastAsia="Calibri" w:hAnsi="Calibri"/>
                 <w:b/>
                 <w:bCs/>
               </w:rPr>
@@ -2042,7 +2081,7 @@
             </w:pPr>
             <w:r>
               <w:rPr>
-                <w:rFonts w:ascii="Arial" w:cs="Arial" w:eastAsia="Arial" w:hAnsi="Arial"/>
+                <w:rFonts w:ascii="Calibri" w:cs="Calibri" w:eastAsia="Calibri" w:hAnsi="Calibri"/>
                 <w:b/>
                 <w:bCs/>
               </w:rPr>
@@ -2074,7 +2113,7 @@
             </w:pPr>
             <w:r>
               <w:rPr>
-                <w:rFonts w:ascii="Arial" w:cs="Arial" w:eastAsia="Arial" w:hAnsi="Arial"/>
+                <w:rFonts w:ascii="Calibri" w:cs="Calibri" w:eastAsia="Calibri" w:hAnsi="Calibri"/>
                 <w:b/>
                 <w:bCs/>
               </w:rPr>
@@ -2106,7 +2145,7 @@
             </w:pPr>
             <w:r>
               <w:rPr>
-                <w:rFonts w:ascii="Arial" w:cs="Arial" w:eastAsia="Arial" w:hAnsi="Arial"/>
+                <w:rFonts w:ascii="Calibri" w:cs="Calibri" w:eastAsia="Calibri" w:hAnsi="Calibri"/>
                 <w:b/>
                 <w:bCs/>
               </w:rPr>
@@ -2142,7 +2181,7 @@
             </w:pPr>
             <w:r>
               <w:rPr>
-                <w:rFonts w:ascii="Arial" w:cs="Arial" w:eastAsia="Arial" w:hAnsi="Arial"/>
+                <w:rFonts w:ascii="Calibri" w:cs="Calibri" w:eastAsia="Calibri" w:hAnsi="Calibri"/>
               </w:rPr>
               <w:t xml:space="preserve">CR-01</w:t>
             </w:r>
@@ -2171,7 +2210,7 @@
             </w:pPr>
             <w:r>
               <w:rPr>
-                <w:rFonts w:ascii="Arial" w:cs="Arial" w:eastAsia="Arial" w:hAnsi="Arial"/>
+                <w:rFonts w:ascii="Calibri" w:cs="Calibri" w:eastAsia="Calibri" w:hAnsi="Calibri"/>
               </w:rPr>
               <w:t xml:space="preserve">Stack del Sprint 3: JavaScript puro y checkout simulado en lugar de Vue.js, Laravel/MySQL y Mercado Pago real</w:t>
             </w:r>
@@ -2200,7 +2239,7 @@
             </w:pPr>
             <w:r>
               <w:rPr>
-                <w:rFonts w:ascii="Arial" w:cs="Arial" w:eastAsia="Arial" w:hAnsi="Arial"/>
+                <w:rFonts w:ascii="Calibri" w:cs="Calibri" w:eastAsia="Calibri" w:hAnsi="Calibri"/>
               </w:rPr>
               <w:t xml:space="preserve">Alcance</w:t>
             </w:r>
@@ -2229,7 +2268,7 @@
             </w:pPr>
             <w:r>
               <w:rPr>
-                <w:rFonts w:ascii="Arial" w:cs="Arial" w:eastAsia="Arial" w:hAnsi="Arial"/>
+                <w:rFonts w:ascii="Calibri" w:cs="Calibri" w:eastAsia="Calibri" w:hAnsi="Calibri"/>
               </w:rPr>
               <w:t xml:space="preserve">Reduce el esfuerzo previsto</w:t>
             </w:r>
@@ -2259,7 +2298,7 @@
             </w:pPr>
             <w:r>
               <w:rPr>
-                <w:rFonts w:ascii="Arial" w:cs="Arial" w:eastAsia="Arial" w:hAnsi="Arial"/>
+                <w:rFonts w:ascii="Calibri" w:cs="Calibri" w:eastAsia="Calibri" w:hAnsi="Calibri"/>
               </w:rPr>
               <w:t xml:space="preserve">Aprobado (PM); validación docente pendiente</w:t>
             </w:r>
@@ -2293,7 +2332,7 @@
             </w:pPr>
             <w:r>
               <w:rPr>
-                <w:rFonts w:ascii="Arial" w:cs="Arial" w:eastAsia="Arial" w:hAnsi="Arial"/>
+                <w:rFonts w:ascii="Calibri" w:cs="Calibri" w:eastAsia="Calibri" w:hAnsi="Calibri"/>
               </w:rPr>
               <w:t xml:space="preserve">CR-02</w:t>
             </w:r>
@@ -2322,7 +2361,7 @@
             </w:pPr>
             <w:r>
               <w:rPr>
-                <w:rFonts w:ascii="Arial" w:cs="Arial" w:eastAsia="Arial" w:hAnsi="Arial"/>
+                <w:rFonts w:ascii="Calibri" w:cs="Calibri" w:eastAsia="Calibri" w:hAnsi="Calibri"/>
               </w:rPr>
               <w:t xml:space="preserve">Botón de Arrepentimiento y formulario de revocación (Res. SCI 424/2020)</w:t>
             </w:r>
@@ -2351,7 +2390,7 @@
             </w:pPr>
             <w:r>
               <w:rPr>
-                <w:rFonts w:ascii="Arial" w:cs="Arial" w:eastAsia="Arial" w:hAnsi="Arial"/>
+                <w:rFonts w:ascii="Calibri" w:cs="Calibri" w:eastAsia="Calibri" w:hAnsi="Calibri"/>
               </w:rPr>
               <w:t xml:space="preserve">Legal</w:t>
             </w:r>
@@ -2380,7 +2419,7 @@
             </w:pPr>
             <w:r>
               <w:rPr>
-                <w:rFonts w:ascii="Arial" w:cs="Arial" w:eastAsia="Arial" w:hAnsi="Arial"/>
+                <w:rFonts w:ascii="Calibri" w:cs="Calibri" w:eastAsia="Calibri" w:hAnsi="Calibri"/>
               </w:rPr>
               <w:t xml:space="preserve">+ 5 hs</w:t>
             </w:r>
@@ -2410,7 +2449,7 @@
             </w:pPr>
             <w:r>
               <w:rPr>
-                <w:rFonts w:ascii="Arial" w:cs="Arial" w:eastAsia="Arial" w:hAnsi="Arial"/>
+                <w:rFonts w:ascii="Calibri" w:cs="Calibri" w:eastAsia="Calibri" w:hAnsi="Calibri"/>
               </w:rPr>
               <w:t xml:space="preserve">Aprobado</w:t>
             </w:r>
@@ -2444,7 +2483,7 @@
             </w:pPr>
             <w:r>
               <w:rPr>
-                <w:rFonts w:ascii="Arial" w:cs="Arial" w:eastAsia="Arial" w:hAnsi="Arial"/>
+                <w:rFonts w:ascii="Calibri" w:cs="Calibri" w:eastAsia="Calibri" w:hAnsi="Calibri"/>
               </w:rPr>
               <w:t xml:space="preserve">CR-03</w:t>
             </w:r>
@@ -2473,7 +2512,7 @@
             </w:pPr>
             <w:r>
               <w:rPr>
-                <w:rFonts w:ascii="Arial" w:cs="Arial" w:eastAsia="Arial" w:hAnsi="Arial"/>
+                <w:rFonts w:ascii="Calibri" w:cs="Calibri" w:eastAsia="Calibri" w:hAnsi="Calibri"/>
               </w:rPr>
               <w:t xml:space="preserve">Código en módulos ES (import/export) en lugar de scripts globales</w:t>
             </w:r>
@@ -2502,7 +2541,7 @@
             </w:pPr>
             <w:r>
               <w:rPr>
-                <w:rFonts w:ascii="Arial" w:cs="Arial" w:eastAsia="Arial" w:hAnsi="Arial"/>
+                <w:rFonts w:ascii="Calibri" w:cs="Calibri" w:eastAsia="Calibri" w:hAnsi="Calibri"/>
               </w:rPr>
               <w:t xml:space="preserve">Técnico</w:t>
             </w:r>
@@ -2531,7 +2570,7 @@
             </w:pPr>
             <w:r>
               <w:rPr>
-                <w:rFonts w:ascii="Arial" w:cs="Arial" w:eastAsia="Arial" w:hAnsi="Arial"/>
+                <w:rFonts w:ascii="Calibri" w:cs="Calibri" w:eastAsia="Calibri" w:hAnsi="Calibri"/>
               </w:rPr>
               <w:t xml:space="preserve">0 hs adicionales</w:t>
             </w:r>
@@ -2561,7 +2600,7 @@
             </w:pPr>
             <w:r>
               <w:rPr>
-                <w:rFonts w:ascii="Arial" w:cs="Arial" w:eastAsia="Arial" w:hAnsi="Arial"/>
+                <w:rFonts w:ascii="Calibri" w:cs="Calibri" w:eastAsia="Calibri" w:hAnsi="Calibri"/>
               </w:rPr>
               <w:t xml:space="preserve">Aprobado e implementado</w:t>
             </w:r>
@@ -2595,7 +2634,7 @@
             </w:pPr>
             <w:r>
               <w:rPr>
-                <w:rFonts w:ascii="Arial" w:cs="Arial" w:eastAsia="Arial" w:hAnsi="Arial"/>
+                <w:rFonts w:ascii="Calibri" w:cs="Calibri" w:eastAsia="Calibri" w:hAnsi="Calibri"/>
               </w:rPr>
               <w:t xml:space="preserve">CR-04</w:t>
             </w:r>
@@ -2624,7 +2663,7 @@
             </w:pPr>
             <w:r>
               <w:rPr>
-                <w:rFonts w:ascii="Arial" w:cs="Arial" w:eastAsia="Arial" w:hAnsi="Arial"/>
+                <w:rFonts w:ascii="Calibri" w:cs="Calibri" w:eastAsia="Calibri" w:hAnsi="Calibri"/>
               </w:rPr>
               <w:t xml:space="preserve">Registro de eventos del sitio para medir el embudo de KPIs</w:t>
             </w:r>
@@ -2653,7 +2692,7 @@
             </w:pPr>
             <w:r>
               <w:rPr>
-                <w:rFonts w:ascii="Arial" w:cs="Arial" w:eastAsia="Arial" w:hAnsi="Arial"/>
+                <w:rFonts w:ascii="Calibri" w:cs="Calibri" w:eastAsia="Calibri" w:hAnsi="Calibri"/>
               </w:rPr>
               <w:t xml:space="preserve">Alcance</w:t>
             </w:r>
@@ -2682,7 +2721,7 @@
             </w:pPr>
             <w:r>
               <w:rPr>
-                <w:rFonts w:ascii="Arial" w:cs="Arial" w:eastAsia="Arial" w:hAnsi="Arial"/>
+                <w:rFonts w:ascii="Calibri" w:cs="Calibri" w:eastAsia="Calibri" w:hAnsi="Calibri"/>
               </w:rPr>
               <w:t xml:space="preserve">+ 5 hs</w:t>
             </w:r>
@@ -2712,7 +2751,7 @@
             </w:pPr>
             <w:r>
               <w:rPr>
-                <w:rFonts w:ascii="Arial" w:cs="Arial" w:eastAsia="Arial" w:hAnsi="Arial"/>
+                <w:rFonts w:ascii="Calibri" w:cs="Calibri" w:eastAsia="Calibri" w:hAnsi="Calibri"/>
               </w:rPr>
               <w:t xml:space="preserve">Diferido al Sprint 4</w:t>
             </w:r>
@@ -2746,7 +2785,7 @@
             </w:pPr>
             <w:r>
               <w:rPr>
-                <w:rFonts w:ascii="Arial" w:cs="Arial" w:eastAsia="Arial" w:hAnsi="Arial"/>
+                <w:rFonts w:ascii="Calibri" w:cs="Calibri" w:eastAsia="Calibri" w:hAnsi="Calibri"/>
               </w:rPr>
               <w:t xml:space="preserve">CR-05</w:t>
             </w:r>
@@ -2775,7 +2814,7 @@
             </w:pPr>
             <w:r>
               <w:rPr>
-                <w:rFonts w:ascii="Arial" w:cs="Arial" w:eastAsia="Arial" w:hAnsi="Arial"/>
+                <w:rFonts w:ascii="Calibri" w:cs="Calibri" w:eastAsia="Calibri" w:hAnsi="Calibri"/>
               </w:rPr>
               <w:t xml:space="preserve">Rediseño visual moderno con animaciones (prototipo aprobado)</w:t>
             </w:r>
@@ -2804,7 +2843,7 @@
             </w:pPr>
             <w:r>
               <w:rPr>
-                <w:rFonts w:ascii="Arial" w:cs="Arial" w:eastAsia="Arial" w:hAnsi="Arial"/>
+                <w:rFonts w:ascii="Calibri" w:cs="Calibri" w:eastAsia="Calibri" w:hAnsi="Calibri"/>
               </w:rPr>
               <w:t xml:space="preserve">Alcance (mejora visual)</w:t>
             </w:r>
@@ -2833,7 +2872,7 @@
             </w:pPr>
             <w:r>
               <w:rPr>
-                <w:rFonts w:ascii="Arial" w:cs="Arial" w:eastAsia="Arial" w:hAnsi="Arial"/>
+                <w:rFonts w:ascii="Calibri" w:cs="Calibri" w:eastAsia="Calibri" w:hAnsi="Calibri"/>
               </w:rPr>
               <w:t xml:space="preserve">+ 4 hs</w:t>
             </w:r>
@@ -2863,7 +2902,7 @@
             </w:pPr>
             <w:r>
               <w:rPr>
-                <w:rFonts w:ascii="Arial" w:cs="Arial" w:eastAsia="Arial" w:hAnsi="Arial"/>
+                <w:rFonts w:ascii="Calibri" w:cs="Calibri" w:eastAsia="Calibri" w:hAnsi="Calibri"/>
               </w:rPr>
               <w:t xml:space="preserve">Aprobado e implementado (adelantado del Sprint 4)</w:t>
             </w:r>
@@ -2882,7 +2921,7 @@
       </w:pPr>
       <w:r>
         <w:rPr>
-          <w:rFonts w:ascii="Arial" w:cs="Arial" w:eastAsia="Arial" w:hAnsi="Arial"/>
+          <w:rFonts w:ascii="Georgia" w:cs="Georgia" w:eastAsia="Georgia" w:hAnsi="Georgia"/>
         </w:rPr>
         <w:t xml:space="preserve">5. FICHAS DETALLADAS</w:t>
       </w:r>
@@ -2895,7 +2934,7 @@
       </w:pPr>
       <w:r>
         <w:rPr>
-          <w:rFonts w:ascii="Arial" w:cs="Arial" w:eastAsia="Arial" w:hAnsi="Arial"/>
+          <w:rFonts w:ascii="Georgia" w:cs="Georgia" w:eastAsia="Georgia" w:hAnsi="Georgia"/>
         </w:rPr>
         <w:t xml:space="preserve">CR-01 · Cambio de stack y de alcance técnico del carrito</w:t>
       </w:r>
@@ -2944,7 +2983,7 @@
             </w:pPr>
             <w:r>
               <w:rPr>
-                <w:rFonts w:ascii="Arial" w:cs="Arial" w:eastAsia="Arial" w:hAnsi="Arial"/>
+                <w:rFonts w:ascii="Calibri" w:cs="Calibri" w:eastAsia="Calibri" w:hAnsi="Calibri"/>
                 <w:b/>
                 <w:bCs/>
               </w:rPr>
@@ -2975,7 +3014,7 @@
             </w:pPr>
             <w:r>
               <w:rPr>
-                <w:rFonts w:ascii="Arial" w:cs="Arial" w:eastAsia="Arial" w:hAnsi="Arial"/>
+                <w:rFonts w:ascii="Calibri" w:cs="Calibri" w:eastAsia="Calibri" w:hAnsi="Calibri"/>
               </w:rPr>
               <w:t xml:space="preserve">Alcance (cambio de stack) · Project Manager</w:t>
             </w:r>
@@ -3010,7 +3049,7 @@
             </w:pPr>
             <w:r>
               <w:rPr>
-                <w:rFonts w:ascii="Arial" w:cs="Arial" w:eastAsia="Arial" w:hAnsi="Arial"/>
+                <w:rFonts w:ascii="Calibri" w:cs="Calibri" w:eastAsia="Calibri" w:hAnsi="Calibri"/>
                 <w:b/>
                 <w:bCs/>
               </w:rPr>
@@ -3041,7 +3080,7 @@
             </w:pPr>
             <w:r>
               <w:rPr>
-                <w:rFonts w:ascii="Arial" w:cs="Arial" w:eastAsia="Arial" w:hAnsi="Arial"/>
+                <w:rFonts w:ascii="Calibri" w:cs="Calibri" w:eastAsia="Calibri" w:hAnsi="Calibri"/>
                 <w:highlight w:val="yellow"/>
                 <w:highlightCs w:val="yellow"/>
               </w:rPr>
@@ -3078,7 +3117,7 @@
             </w:pPr>
             <w:r>
               <w:rPr>
-                <w:rFonts w:ascii="Arial" w:cs="Arial" w:eastAsia="Arial" w:hAnsi="Arial"/>
+                <w:rFonts w:ascii="Calibri" w:cs="Calibri" w:eastAsia="Calibri" w:hAnsi="Calibri"/>
                 <w:b/>
                 <w:bCs/>
               </w:rPr>
@@ -3109,7 +3148,7 @@
             </w:pPr>
             <w:r>
               <w:rPr>
-                <w:rFonts w:ascii="Arial" w:cs="Arial" w:eastAsia="Arial" w:hAnsi="Arial"/>
+                <w:rFonts w:ascii="Calibri" w:cs="Calibri" w:eastAsia="Calibri" w:hAnsi="Calibri"/>
               </w:rPr>
               <w:t xml:space="preserve">La planificación inicial preveía Vue.js para el carrito y, para la etapa siguiente, Laravel (PHP), MySQL y Mercado Pago real. La consigna del Sprint 3 pide JavaScript modular que consuma productos.json con Fetch API, un carrito en JS y un checkout con confirmación simulada. Se ajusta el alcance a lo que exige la consigna.</w:t>
             </w:r>
@@ -3144,7 +3183,7 @@
             </w:pPr>
             <w:r>
               <w:rPr>
-                <w:rFonts w:ascii="Arial" w:cs="Arial" w:eastAsia="Arial" w:hAnsi="Arial"/>
+                <w:rFonts w:ascii="Calibri" w:cs="Calibri" w:eastAsia="Calibri" w:hAnsi="Calibri"/>
                 <w:b/>
                 <w:bCs/>
               </w:rPr>
@@ -3175,7 +3214,7 @@
             </w:pPr>
             <w:r>
               <w:rPr>
-                <w:rFonts w:ascii="Arial" w:cs="Arial" w:eastAsia="Arial" w:hAnsi="Arial"/>
+                <w:rFonts w:ascii="Calibri" w:cs="Calibri" w:eastAsia="Calibri" w:hAnsi="Calibri"/>
               </w:rPr>
               <w:t xml:space="preserve">Se mueve fuera del sprint el backend, la base de datos y la pasarela de pago real. Se mantiene el catálogo dinámico, el carrito y la validación del checkout.</w:t>
             </w:r>
@@ -3210,7 +3249,7 @@
             </w:pPr>
             <w:r>
               <w:rPr>
-                <w:rFonts w:ascii="Arial" w:cs="Arial" w:eastAsia="Arial" w:hAnsi="Arial"/>
+                <w:rFonts w:ascii="Calibri" w:cs="Calibri" w:eastAsia="Calibri" w:hAnsi="Calibri"/>
                 <w:b/>
                 <w:bCs/>
               </w:rPr>
@@ -3241,7 +3280,7 @@
             </w:pPr>
             <w:r>
               <w:rPr>
-                <w:rFonts w:ascii="Arial" w:cs="Arial" w:eastAsia="Arial" w:hAnsi="Arial"/>
+                <w:rFonts w:ascii="Calibri" w:cs="Calibri" w:eastAsia="Calibri" w:hAnsi="Calibri"/>
               </w:rPr>
               <w:t xml:space="preserve">Reduce el esfuerzo previsto y evita una dependencia técnica pesada. No afecta la fecha de entrega.</w:t>
             </w:r>
@@ -3276,7 +3315,7 @@
             </w:pPr>
             <w:r>
               <w:rPr>
-                <w:rFonts w:ascii="Arial" w:cs="Arial" w:eastAsia="Arial" w:hAnsi="Arial"/>
+                <w:rFonts w:ascii="Calibri" w:cs="Calibri" w:eastAsia="Calibri" w:hAnsi="Calibri"/>
                 <w:b/>
                 <w:bCs/>
               </w:rPr>
@@ -3307,7 +3346,7 @@
             </w:pPr>
             <w:r>
               <w:rPr>
-                <w:rFonts w:ascii="Arial" w:cs="Arial" w:eastAsia="Arial" w:hAnsi="Arial"/>
+                <w:rFonts w:ascii="Calibri" w:cs="Calibri" w:eastAsia="Calibri" w:hAnsi="Calibri"/>
               </w:rPr>
               <w:t xml:space="preserve">Reduce el riesgo de integración del checkout identificado en el Acta. Nuevo riesgo: que el sitio sin backend parezca menos completo; se mitiga documentando el diseño del pago como proyección futura.</w:t>
             </w:r>
@@ -3342,7 +3381,7 @@
             </w:pPr>
             <w:r>
               <w:rPr>
-                <w:rFonts w:ascii="Arial" w:cs="Arial" w:eastAsia="Arial" w:hAnsi="Arial"/>
+                <w:rFonts w:ascii="Calibri" w:cs="Calibri" w:eastAsia="Calibri" w:hAnsi="Calibri"/>
                 <w:b/>
                 <w:bCs/>
               </w:rPr>
@@ -3373,13 +3412,13 @@
             </w:pPr>
             <w:r>
               <w:rPr>
-                <w:rFonts w:ascii="Arial" w:cs="Arial" w:eastAsia="Arial" w:hAnsi="Arial"/>
+                <w:rFonts w:ascii="Calibri" w:cs="Calibri" w:eastAsia="Calibri" w:hAnsi="Calibri"/>
               </w:rPr>
               <w:t xml:space="preserve">Aprobado por la PM como decisión técnica. Como retira del alcance una funcionalidad del Acta (integración con Mercado Pago), requiere validación del docente: </w:t>
             </w:r>
             <w:r>
               <w:rPr>
-                <w:rFonts w:ascii="Arial" w:cs="Arial" w:eastAsia="Arial" w:hAnsi="Arial"/>
+                <w:rFonts w:ascii="Calibri" w:cs="Calibri" w:eastAsia="Calibri" w:hAnsi="Calibri"/>
                 <w:highlight w:val="yellow"/>
                 <w:highlightCs w:val="yellow"/>
               </w:rPr>
@@ -3387,7 +3426,7 @@
             </w:r>
             <w:r>
               <w:rPr>
-                <w:rFonts w:ascii="Arial" w:cs="Arial" w:eastAsia="Arial" w:hAnsi="Arial"/>
+                <w:rFonts w:ascii="Calibri" w:cs="Calibri" w:eastAsia="Calibri" w:hAnsi="Calibri"/>
               </w:rPr>
               <w:t xml:space="preserve">.</w:t>
             </w:r>
@@ -3422,7 +3461,7 @@
             </w:pPr>
             <w:r>
               <w:rPr>
-                <w:rFonts w:ascii="Arial" w:cs="Arial" w:eastAsia="Arial" w:hAnsi="Arial"/>
+                <w:rFonts w:ascii="Calibri" w:cs="Calibri" w:eastAsia="Calibri" w:hAnsi="Calibri"/>
                 <w:b/>
                 <w:bCs/>
               </w:rPr>
@@ -3453,7 +3492,7 @@
             </w:pPr>
             <w:r>
               <w:rPr>
-                <w:rFonts w:ascii="Arial" w:cs="Arial" w:eastAsia="Arial" w:hAnsi="Arial"/>
+                <w:rFonts w:ascii="Calibri" w:cs="Calibri" w:eastAsia="Calibri" w:hAnsi="Calibri"/>
               </w:rPr>
               <w:t xml:space="preserve">Tarjetas actualizadas en el Kanban. La pasarela real queda como proyección del Sprint 4.</w:t>
             </w:r>
@@ -3469,7 +3508,7 @@
       </w:pPr>
       <w:r>
         <w:rPr>
-          <w:rFonts w:ascii="Arial" w:cs="Arial" w:eastAsia="Arial" w:hAnsi="Arial"/>
+          <w:rFonts w:ascii="Georgia" w:cs="Georgia" w:eastAsia="Georgia" w:hAnsi="Georgia"/>
         </w:rPr>
         <w:t xml:space="preserve">CR-02 · Botón de Arrepentimiento</w:t>
       </w:r>
@@ -3518,7 +3557,7 @@
             </w:pPr>
             <w:r>
               <w:rPr>
-                <w:rFonts w:ascii="Arial" w:cs="Arial" w:eastAsia="Arial" w:hAnsi="Arial"/>
+                <w:rFonts w:ascii="Calibri" w:cs="Calibri" w:eastAsia="Calibri" w:hAnsi="Calibri"/>
                 <w:b/>
                 <w:bCs/>
               </w:rPr>
@@ -3549,7 +3588,7 @@
             </w:pPr>
             <w:r>
               <w:rPr>
-                <w:rFonts w:ascii="Arial" w:cs="Arial" w:eastAsia="Arial" w:hAnsi="Arial"/>
+                <w:rFonts w:ascii="Calibri" w:cs="Calibri" w:eastAsia="Calibri" w:hAnsi="Calibri"/>
               </w:rPr>
               <w:t xml:space="preserve">Legal · Legal &amp; Compliance Officer</w:t>
             </w:r>
@@ -3584,7 +3623,7 @@
             </w:pPr>
             <w:r>
               <w:rPr>
-                <w:rFonts w:ascii="Arial" w:cs="Arial" w:eastAsia="Arial" w:hAnsi="Arial"/>
+                <w:rFonts w:ascii="Calibri" w:cs="Calibri" w:eastAsia="Calibri" w:hAnsi="Calibri"/>
                 <w:b/>
                 <w:bCs/>
               </w:rPr>
@@ -3615,7 +3654,7 @@
             </w:pPr>
             <w:r>
               <w:rPr>
-                <w:rFonts w:ascii="Arial" w:cs="Arial" w:eastAsia="Arial" w:hAnsi="Arial"/>
+                <w:rFonts w:ascii="Calibri" w:cs="Calibri" w:eastAsia="Calibri" w:hAnsi="Calibri"/>
               </w:rPr>
               <w:t xml:space="preserve">14/10/2026</w:t>
             </w:r>
@@ -3650,7 +3689,7 @@
             </w:pPr>
             <w:r>
               <w:rPr>
-                <w:rFonts w:ascii="Arial" w:cs="Arial" w:eastAsia="Arial" w:hAnsi="Arial"/>
+                <w:rFonts w:ascii="Calibri" w:cs="Calibri" w:eastAsia="Calibri" w:hAnsi="Calibri"/>
                 <w:b/>
                 <w:bCs/>
               </w:rPr>
@@ -3681,7 +3720,7 @@
             </w:pPr>
             <w:r>
               <w:rPr>
-                <w:rFonts w:ascii="Arial" w:cs="Arial" w:eastAsia="Arial" w:hAnsi="Arial"/>
+                <w:rFonts w:ascii="Calibri" w:cs="Calibri" w:eastAsia="Calibri" w:hAnsi="Calibri"/>
               </w:rPr>
               <w:t xml:space="preserve">Al redactar los Términos y Condiciones (Tarea 3.7 y 3.8) se detecta que los sitios de venta online deben publicar un enlace "Botón de Arrepentimiento" visible desde el inicio, sin registro previo (Res. SCI 424/2020). El código del sprint no lo contemplaba.</w:t>
             </w:r>
@@ -3716,7 +3755,7 @@
             </w:pPr>
             <w:r>
               <w:rPr>
-                <w:rFonts w:ascii="Arial" w:cs="Arial" w:eastAsia="Arial" w:hAnsi="Arial"/>
+                <w:rFonts w:ascii="Calibri" w:cs="Calibri" w:eastAsia="Calibri" w:hAnsi="Calibri"/>
                 <w:b/>
                 <w:bCs/>
               </w:rPr>
@@ -3747,7 +3786,7 @@
             </w:pPr>
             <w:r>
               <w:rPr>
-                <w:rFonts w:ascii="Arial" w:cs="Arial" w:eastAsia="Arial" w:hAnsi="Arial"/>
+                <w:rFonts w:ascii="Calibri" w:cs="Calibri" w:eastAsia="Calibri" w:hAnsi="Calibri"/>
               </w:rPr>
               <w:t xml:space="preserve">Enlace destacado en el Home y el footer, formulario de revocación (nombre, correo, N.º de pedido, producto), código de arrepentimiento simulado y leyenda de los 10 días en el checkout.</w:t>
             </w:r>
@@ -3782,7 +3821,7 @@
             </w:pPr>
             <w:r>
               <w:rPr>
-                <w:rFonts w:ascii="Arial" w:cs="Arial" w:eastAsia="Arial" w:hAnsi="Arial"/>
+                <w:rFonts w:ascii="Calibri" w:cs="Calibri" w:eastAsia="Calibri" w:hAnsi="Calibri"/>
                 <w:b/>
                 <w:bCs/>
               </w:rPr>
@@ -3813,7 +3852,7 @@
             </w:pPr>
             <w:r>
               <w:rPr>
-                <w:rFonts w:ascii="Arial" w:cs="Arial" w:eastAsia="Arial" w:hAnsi="Arial"/>
+                <w:rFonts w:ascii="Calibri" w:cs="Calibri" w:eastAsia="Calibri" w:hAnsi="Calibri"/>
               </w:rPr>
               <w:t xml:space="preserve">+ 5 hs estimadas ($ 12.500 simulados). Se absorbe en las semanas 8 y 9 sin mover la fecha del 23/10.</w:t>
             </w:r>
@@ -3848,7 +3887,7 @@
             </w:pPr>
             <w:r>
               <w:rPr>
-                <w:rFonts w:ascii="Arial" w:cs="Arial" w:eastAsia="Arial" w:hAnsi="Arial"/>
+                <w:rFonts w:ascii="Calibri" w:cs="Calibri" w:eastAsia="Calibri" w:hAnsi="Calibri"/>
                 <w:b/>
                 <w:bCs/>
               </w:rPr>
@@ -3879,7 +3918,7 @@
             </w:pPr>
             <w:r>
               <w:rPr>
-                <w:rFonts w:ascii="Arial" w:cs="Arial" w:eastAsia="Arial" w:hAnsi="Arial"/>
+                <w:rFonts w:ascii="Calibri" w:cs="Calibri" w:eastAsia="Calibri" w:hAnsi="Calibri"/>
               </w:rPr>
               <w:t xml:space="preserve">Riesgo de sobrecarga individual (identificado en el Acta). Se mitiga delegando la implementación en una rama propia (issue #61) y priorizándola por sobre mejoras estéticas.</w:t>
             </w:r>
@@ -3914,7 +3953,7 @@
             </w:pPr>
             <w:r>
               <w:rPr>
-                <w:rFonts w:ascii="Arial" w:cs="Arial" w:eastAsia="Arial" w:hAnsi="Arial"/>
+                <w:rFonts w:ascii="Calibri" w:cs="Calibri" w:eastAsia="Calibri" w:hAnsi="Calibri"/>
                 <w:b/>
                 <w:bCs/>
               </w:rPr>
@@ -3945,7 +3984,7 @@
             </w:pPr>
             <w:r>
               <w:rPr>
-                <w:rFonts w:ascii="Arial" w:cs="Arial" w:eastAsia="Arial" w:hAnsi="Arial"/>
+                <w:rFonts w:ascii="Calibri" w:cs="Calibri" w:eastAsia="Calibri" w:hAnsi="Calibri"/>
               </w:rPr>
               <w:t xml:space="preserve">Aprobado. Es un requisito legal obligatorio y forma parte de la coherencia entre el software y las cláusulas exigida por la consigna. Se informa al docente en la revisión semanal.</w:t>
             </w:r>
@@ -3980,7 +4019,7 @@
             </w:pPr>
             <w:r>
               <w:rPr>
-                <w:rFonts w:ascii="Arial" w:cs="Arial" w:eastAsia="Arial" w:hAnsi="Arial"/>
+                <w:rFonts w:ascii="Calibri" w:cs="Calibri" w:eastAsia="Calibri" w:hAnsi="Calibri"/>
                 <w:b/>
                 <w:bCs/>
               </w:rPr>
@@ -4011,7 +4050,7 @@
             </w:pPr>
             <w:r>
               <w:rPr>
-                <w:rFonts w:ascii="Arial" w:cs="Arial" w:eastAsia="Arial" w:hAnsi="Arial"/>
+                <w:rFonts w:ascii="Calibri" w:cs="Calibri" w:eastAsia="Calibri" w:hAnsi="Calibri"/>
               </w:rPr>
               <w:t xml:space="preserve">Se posterga el pulido visual de pantallas secundarias; la validación del checkout (Tarea 3.2) mantiene su prioridad.</w:t>
             </w:r>
@@ -4027,7 +4066,7 @@
       </w:pPr>
       <w:r>
         <w:rPr>
-          <w:rFonts w:ascii="Arial" w:cs="Arial" w:eastAsia="Arial" w:hAnsi="Arial"/>
+          <w:rFonts w:ascii="Georgia" w:cs="Georgia" w:eastAsia="Georgia" w:hAnsi="Georgia"/>
         </w:rPr>
         <w:t xml:space="preserve">CR-03 · Migración del código a módulos ES</w:t>
       </w:r>
@@ -4076,7 +4115,7 @@
             </w:pPr>
             <w:r>
               <w:rPr>
-                <w:rFonts w:ascii="Arial" w:cs="Arial" w:eastAsia="Arial" w:hAnsi="Arial"/>
+                <w:rFonts w:ascii="Calibri" w:cs="Calibri" w:eastAsia="Calibri" w:hAnsi="Calibri"/>
                 <w:b/>
                 <w:bCs/>
               </w:rPr>
@@ -4107,7 +4146,7 @@
             </w:pPr>
             <w:r>
               <w:rPr>
-                <w:rFonts w:ascii="Arial" w:cs="Arial" w:eastAsia="Arial" w:hAnsi="Arial"/>
+                <w:rFonts w:ascii="Calibri" w:cs="Calibri" w:eastAsia="Calibri" w:hAnsi="Calibri"/>
               </w:rPr>
               <w:t xml:space="preserve">Técnico · Lead Developer</w:t>
             </w:r>
@@ -4142,7 +4181,7 @@
             </w:pPr>
             <w:r>
               <w:rPr>
-                <w:rFonts w:ascii="Arial" w:cs="Arial" w:eastAsia="Arial" w:hAnsi="Arial"/>
+                <w:rFonts w:ascii="Calibri" w:cs="Calibri" w:eastAsia="Calibri" w:hAnsi="Calibri"/>
                 <w:b/>
                 <w:bCs/>
               </w:rPr>
@@ -4173,7 +4212,7 @@
             </w:pPr>
             <w:r>
               <w:rPr>
-                <w:rFonts w:ascii="Arial" w:cs="Arial" w:eastAsia="Arial" w:hAnsi="Arial"/>
+                <w:rFonts w:ascii="Calibri" w:cs="Calibri" w:eastAsia="Calibri" w:hAnsi="Calibri"/>
               </w:rPr>
               <w:t xml:space="preserve">14/10/2026</w:t>
             </w:r>
@@ -4208,7 +4247,7 @@
             </w:pPr>
             <w:r>
               <w:rPr>
-                <w:rFonts w:ascii="Arial" w:cs="Arial" w:eastAsia="Arial" w:hAnsi="Arial"/>
+                <w:rFonts w:ascii="Calibri" w:cs="Calibri" w:eastAsia="Calibri" w:hAnsi="Calibri"/>
                 <w:b/>
                 <w:bCs/>
               </w:rPr>
@@ -4239,7 +4278,7 @@
             </w:pPr>
             <w:r>
               <w:rPr>
-                <w:rFonts w:ascii="Arial" w:cs="Arial" w:eastAsia="Arial" w:hAnsi="Arial"/>
+                <w:rFonts w:ascii="Calibri" w:cs="Calibri" w:eastAsia="Calibri" w:hAnsi="Calibri"/>
               </w:rPr>
               <w:t xml:space="preserve">Para que el catálogo pueda importar la función de agregar al carrito, el código pasa de scripts globales a módulos ES (import/export). Mejora la organización y evita dependencias ocultas entre archivos.</w:t>
             </w:r>
@@ -4274,7 +4313,7 @@
             </w:pPr>
             <w:r>
               <w:rPr>
-                <w:rFonts w:ascii="Arial" w:cs="Arial" w:eastAsia="Arial" w:hAnsi="Arial"/>
+                <w:rFonts w:ascii="Calibri" w:cs="Calibri" w:eastAsia="Calibri" w:hAnsi="Calibri"/>
                 <w:b/>
                 <w:bCs/>
               </w:rPr>
@@ -4305,7 +4344,7 @@
             </w:pPr>
             <w:r>
               <w:rPr>
-                <w:rFonts w:ascii="Arial" w:cs="Arial" w:eastAsia="Arial" w:hAnsi="Arial"/>
+                <w:rFonts w:ascii="Calibri" w:cs="Calibri" w:eastAsia="Calibri" w:hAnsi="Calibri"/>
               </w:rPr>
               <w:t xml:space="preserve">Archivos JavaScript del proyecto y la forma de cargarlos en las páginas HTML. No cambia lo que ve el usuario.</w:t>
             </w:r>
@@ -4340,7 +4379,7 @@
             </w:pPr>
             <w:r>
               <w:rPr>
-                <w:rFonts w:ascii="Arial" w:cs="Arial" w:eastAsia="Arial" w:hAnsi="Arial"/>
+                <w:rFonts w:ascii="Calibri" w:cs="Calibri" w:eastAsia="Calibri" w:hAnsi="Calibri"/>
                 <w:b/>
                 <w:bCs/>
               </w:rPr>
@@ -4371,7 +4410,7 @@
             </w:pPr>
             <w:r>
               <w:rPr>
-                <w:rFonts w:ascii="Arial" w:cs="Arial" w:eastAsia="Arial" w:hAnsi="Arial"/>
+                <w:rFonts w:ascii="Calibri" w:cs="Calibri" w:eastAsia="Calibri" w:hAnsi="Calibri"/>
               </w:rPr>
               <w:t xml:space="preserve">Sin horas adicionales: se realizó dentro de la tarea del catálogo dinámico (issue #59).</w:t>
             </w:r>
@@ -4406,7 +4445,7 @@
             </w:pPr>
             <w:r>
               <w:rPr>
-                <w:rFonts w:ascii="Arial" w:cs="Arial" w:eastAsia="Arial" w:hAnsi="Arial"/>
+                <w:rFonts w:ascii="Calibri" w:cs="Calibri" w:eastAsia="Calibri" w:hAnsi="Calibri"/>
                 <w:b/>
                 <w:bCs/>
               </w:rPr>
@@ -4437,7 +4476,7 @@
             </w:pPr>
             <w:r>
               <w:rPr>
-                <w:rFonts w:ascii="Arial" w:cs="Arial" w:eastAsia="Arial" w:hAnsi="Arial"/>
+                <w:rFonts w:ascii="Calibri" w:cs="Calibri" w:eastAsia="Calibri" w:hAnsi="Calibri"/>
               </w:rPr>
               <w:t xml:space="preserve">Los módulos no funcionan abriendo el archivo con doble clic (file://). Se mitiga usando Live Server o GitHub Pages para las pruebas y la demostración.</w:t>
             </w:r>
@@ -4472,7 +4511,7 @@
             </w:pPr>
             <w:r>
               <w:rPr>
-                <w:rFonts w:ascii="Arial" w:cs="Arial" w:eastAsia="Arial" w:hAnsi="Arial"/>
+                <w:rFonts w:ascii="Calibri" w:cs="Calibri" w:eastAsia="Calibri" w:hAnsi="Calibri"/>
                 <w:b/>
                 <w:bCs/>
               </w:rPr>
@@ -4503,7 +4542,7 @@
             </w:pPr>
             <w:r>
               <w:rPr>
-                <w:rFonts w:ascii="Arial" w:cs="Arial" w:eastAsia="Arial" w:hAnsi="Arial"/>
+                <w:rFonts w:ascii="Calibri" w:cs="Calibri" w:eastAsia="Calibri" w:hAnsi="Calibri"/>
               </w:rPr>
               <w:t xml:space="preserve">Aprobado por la PM (diseño técnico, decisión autónoma según el Acta).</w:t>
             </w:r>
@@ -4519,7 +4558,7 @@
       </w:pPr>
       <w:r>
         <w:rPr>
-          <w:rFonts w:ascii="Arial" w:cs="Arial" w:eastAsia="Arial" w:hAnsi="Arial"/>
+          <w:rFonts w:ascii="Georgia" w:cs="Georgia" w:eastAsia="Georgia" w:hAnsi="Georgia"/>
         </w:rPr>
         <w:t xml:space="preserve">CR-04 · Registro de eventos para medir el embudo</w:t>
       </w:r>
@@ -4568,7 +4607,7 @@
             </w:pPr>
             <w:r>
               <w:rPr>
-                <w:rFonts w:ascii="Arial" w:cs="Arial" w:eastAsia="Arial" w:hAnsi="Arial"/>
+                <w:rFonts w:ascii="Calibri" w:cs="Calibri" w:eastAsia="Calibri" w:hAnsi="Calibri"/>
                 <w:b/>
                 <w:bCs/>
               </w:rPr>
@@ -4599,7 +4638,7 @@
             </w:pPr>
             <w:r>
               <w:rPr>
-                <w:rFonts w:ascii="Arial" w:cs="Arial" w:eastAsia="Arial" w:hAnsi="Arial"/>
+                <w:rFonts w:ascii="Calibri" w:cs="Calibri" w:eastAsia="Calibri" w:hAnsi="Calibri"/>
               </w:rPr>
               <w:t xml:space="preserve">Alcance (mejora) · Project Manager</w:t>
             </w:r>
@@ -4634,7 +4673,7 @@
             </w:pPr>
             <w:r>
               <w:rPr>
-                <w:rFonts w:ascii="Arial" w:cs="Arial" w:eastAsia="Arial" w:hAnsi="Arial"/>
+                <w:rFonts w:ascii="Calibri" w:cs="Calibri" w:eastAsia="Calibri" w:hAnsi="Calibri"/>
                 <w:b/>
                 <w:bCs/>
               </w:rPr>
@@ -4665,7 +4704,7 @@
             </w:pPr>
             <w:r>
               <w:rPr>
-                <w:rFonts w:ascii="Arial" w:cs="Arial" w:eastAsia="Arial" w:hAnsi="Arial"/>
+                <w:rFonts w:ascii="Calibri" w:cs="Calibri" w:eastAsia="Calibri" w:hAnsi="Calibri"/>
               </w:rPr>
               <w:t xml:space="preserve">14/10/2026</w:t>
             </w:r>
@@ -4700,7 +4739,7 @@
             </w:pPr>
             <w:r>
               <w:rPr>
-                <w:rFonts w:ascii="Arial" w:cs="Arial" w:eastAsia="Arial" w:hAnsi="Arial"/>
+                <w:rFonts w:ascii="Calibri" w:cs="Calibri" w:eastAsia="Calibri" w:hAnsi="Calibri"/>
                 <w:b/>
                 <w:bCs/>
               </w:rPr>
@@ -4731,7 +4770,7 @@
             </w:pPr>
             <w:r>
               <w:rPr>
-                <w:rFonts w:ascii="Arial" w:cs="Arial" w:eastAsia="Arial" w:hAnsi="Arial"/>
+                <w:rFonts w:ascii="Calibri" w:cs="Calibri" w:eastAsia="Calibri" w:hAnsi="Calibri"/>
               </w:rPr>
               <w:t xml:space="preserve">Registrar en el sitio los eventos del embudo (ver catálogo, agregar al carrito, iniciar checkout, confirmar compra) para calcular los KPIs a partir de datos del sitio y no de un conteo manual.</w:t>
             </w:r>
@@ -4766,7 +4805,7 @@
             </w:pPr>
             <w:r>
               <w:rPr>
-                <w:rFonts w:ascii="Arial" w:cs="Arial" w:eastAsia="Arial" w:hAnsi="Arial"/>
+                <w:rFonts w:ascii="Calibri" w:cs="Calibri" w:eastAsia="Calibri" w:hAnsi="Calibri"/>
                 <w:b/>
                 <w:bCs/>
               </w:rPr>
@@ -4797,7 +4836,7 @@
             </w:pPr>
             <w:r>
               <w:rPr>
-                <w:rFonts w:ascii="Arial" w:cs="Arial" w:eastAsia="Arial" w:hAnsi="Arial"/>
+                <w:rFonts w:ascii="Calibri" w:cs="Calibri" w:eastAsia="Calibri" w:hAnsi="Calibri"/>
               </w:rPr>
               <w:t xml:space="preserve">Pequeño módulo de registro de eventos y una vista de resumen. No está exigido por la consigna.</w:t>
             </w:r>
@@ -4832,7 +4871,7 @@
             </w:pPr>
             <w:r>
               <w:rPr>
-                <w:rFonts w:ascii="Arial" w:cs="Arial" w:eastAsia="Arial" w:hAnsi="Arial"/>
+                <w:rFonts w:ascii="Calibri" w:cs="Calibri" w:eastAsia="Calibri" w:hAnsi="Calibri"/>
                 <w:b/>
                 <w:bCs/>
               </w:rPr>
@@ -4863,7 +4902,7 @@
             </w:pPr>
             <w:r>
               <w:rPr>
-                <w:rFonts w:ascii="Arial" w:cs="Arial" w:eastAsia="Arial" w:hAnsi="Arial"/>
+                <w:rFonts w:ascii="Calibri" w:cs="Calibri" w:eastAsia="Calibri" w:hAnsi="Calibri"/>
               </w:rPr>
               <w:t xml:space="preserve">+ 5 hs estimadas ($ 12.500 simulados). Pondría en riesgo la entrega del 23/10 al sumarse al CR-02 y a la validación del checkout.</w:t>
             </w:r>
@@ -4898,7 +4937,7 @@
             </w:pPr>
             <w:r>
               <w:rPr>
-                <w:rFonts w:ascii="Arial" w:cs="Arial" w:eastAsia="Arial" w:hAnsi="Arial"/>
+                <w:rFonts w:ascii="Calibri" w:cs="Calibri" w:eastAsia="Calibri" w:hAnsi="Calibri"/>
                 <w:b/>
                 <w:bCs/>
               </w:rPr>
@@ -4929,7 +4968,7 @@
             </w:pPr>
             <w:r>
               <w:rPr>
-                <w:rFonts w:ascii="Arial" w:cs="Arial" w:eastAsia="Arial" w:hAnsi="Arial"/>
+                <w:rFonts w:ascii="Calibri" w:cs="Calibri" w:eastAsia="Calibri" w:hAnsi="Calibri"/>
               </w:rPr>
               <w:t xml:space="preserve">Aumenta la sobrecarga de tareas de una única persona y compite con funcionalidades obligatorias.</w:t>
             </w:r>
@@ -4964,7 +5003,7 @@
             </w:pPr>
             <w:r>
               <w:rPr>
-                <w:rFonts w:ascii="Arial" w:cs="Arial" w:eastAsia="Arial" w:hAnsi="Arial"/>
+                <w:rFonts w:ascii="Calibri" w:cs="Calibri" w:eastAsia="Calibri" w:hAnsi="Calibri"/>
                 <w:b/>
                 <w:bCs/>
               </w:rPr>
@@ -4995,7 +5034,7 @@
             </w:pPr>
             <w:r>
               <w:rPr>
-                <w:rFonts w:ascii="Arial" w:cs="Arial" w:eastAsia="Arial" w:hAnsi="Arial"/>
+                <w:rFonts w:ascii="Calibri" w:cs="Calibri" w:eastAsia="Calibri" w:hAnsi="Calibri"/>
               </w:rPr>
               <w:t xml:space="preserve">Diferido al Sprint 4 por decisión de la PM; no se rechaza porque aporta valor a la medición.</w:t>
             </w:r>
@@ -5030,7 +5069,7 @@
             </w:pPr>
             <w:r>
               <w:rPr>
-                <w:rFonts w:ascii="Arial" w:cs="Arial" w:eastAsia="Arial" w:hAnsi="Arial"/>
+                <w:rFonts w:ascii="Calibri" w:cs="Calibri" w:eastAsia="Calibri" w:hAnsi="Calibri"/>
                 <w:b/>
                 <w:bCs/>
               </w:rPr>
@@ -5061,7 +5100,7 @@
             </w:pPr>
             <w:r>
               <w:rPr>
-                <w:rFonts w:ascii="Arial" w:cs="Arial" w:eastAsia="Arial" w:hAnsi="Arial"/>
+                <w:rFonts w:ascii="Calibri" w:cs="Calibri" w:eastAsia="Calibri" w:hAnsi="Calibri"/>
               </w:rPr>
               <w:t xml:space="preserve">Los KPIs se completan con Instagram Insights y un conteo manual, como indica el registro semanal del panel de KPIs.</w:t>
             </w:r>
@@ -5077,7 +5116,7 @@
       </w:pPr>
       <w:r>
         <w:rPr>
-          <w:rFonts w:ascii="Arial" w:cs="Arial" w:eastAsia="Arial" w:hAnsi="Arial"/>
+          <w:rFonts w:ascii="Georgia" w:cs="Georgia" w:eastAsia="Georgia" w:hAnsi="Georgia"/>
         </w:rPr>
         <w:t xml:space="preserve">CR-05 · Rediseño visual moderno con animaciones</w:t>
       </w:r>
@@ -5126,7 +5165,7 @@
             </w:pPr>
             <w:r>
               <w:rPr>
-                <w:rFonts w:ascii="Arial" w:cs="Arial" w:eastAsia="Arial" w:hAnsi="Arial"/>
+                <w:rFonts w:ascii="Calibri" w:cs="Calibri" w:eastAsia="Calibri" w:hAnsi="Calibri"/>
                 <w:b/>
                 <w:bCs/>
               </w:rPr>
@@ -5157,7 +5196,7 @@
             </w:pPr>
             <w:r>
               <w:rPr>
-                <w:rFonts w:ascii="Arial" w:cs="Arial" w:eastAsia="Arial" w:hAnsi="Arial"/>
+                <w:rFonts w:ascii="Calibri" w:cs="Calibri" w:eastAsia="Calibri" w:hAnsi="Calibri"/>
               </w:rPr>
               <w:t xml:space="preserve">Alcance (mejora visual) · Project Manager</w:t>
             </w:r>
@@ -5192,7 +5231,7 @@
             </w:pPr>
             <w:r>
               <w:rPr>
-                <w:rFonts w:ascii="Arial" w:cs="Arial" w:eastAsia="Arial" w:hAnsi="Arial"/>
+                <w:rFonts w:ascii="Calibri" w:cs="Calibri" w:eastAsia="Calibri" w:hAnsi="Calibri"/>
                 <w:b/>
                 <w:bCs/>
               </w:rPr>
@@ -5223,7 +5262,7 @@
             </w:pPr>
             <w:r>
               <w:rPr>
-                <w:rFonts w:ascii="Arial" w:cs="Arial" w:eastAsia="Arial" w:hAnsi="Arial"/>
+                <w:rFonts w:ascii="Calibri" w:cs="Calibri" w:eastAsia="Calibri" w:hAnsi="Calibri"/>
               </w:rPr>
               <w:t xml:space="preserve">Registrada el 20/10/2026 · reprogramada e implementada el 22/10/2026</w:t>
             </w:r>
@@ -5258,7 +5297,7 @@
             </w:pPr>
             <w:r>
               <w:rPr>
-                <w:rFonts w:ascii="Arial" w:cs="Arial" w:eastAsia="Arial" w:hAnsi="Arial"/>
+                <w:rFonts w:ascii="Calibri" w:cs="Calibri" w:eastAsia="Calibri" w:hAnsi="Calibri"/>
                 <w:b/>
                 <w:bCs/>
               </w:rPr>
@@ -5289,7 +5328,7 @@
             </w:pPr>
             <w:r>
               <w:rPr>
-                <w:rFonts w:ascii="Arial" w:cs="Arial" w:eastAsia="Arial" w:hAnsi="Arial"/>
+                <w:rFonts w:ascii="Calibri" w:cs="Calibri" w:eastAsia="Calibri" w:hAnsi="Calibri"/>
               </w:rPr>
               <w:t xml:space="preserve">Modernizar la estética del sitio a partir de un prototipo visual aprobado: animaciones de entrada, hero con la foto en forma de arco, cinta animada con las flores del monte, header translúcido, tarjetas que se elevan al pasar el mouse, aviso flotante al agregar un producto y sección "Del monte a tu mesa". El 20/10 se registró y se difirió al Sprint 4. El 22/10 se reprogramó al Sprint 3 porque el Sprint 4 queda reservado para el cierre, el despliegue y el Pitch de Negocios, y la demostración final tiene que mostrar el diseño definitivo.</w:t>
             </w:r>
@@ -5324,7 +5363,7 @@
             </w:pPr>
             <w:r>
               <w:rPr>
-                <w:rFonts w:ascii="Arial" w:cs="Arial" w:eastAsia="Arial" w:hAnsi="Arial"/>
+                <w:rFonts w:ascii="Calibri" w:cs="Calibri" w:eastAsia="Calibri" w:hAnsi="Calibri"/>
                 <w:b/>
                 <w:bCs/>
               </w:rPr>
@@ -5355,7 +5394,7 @@
             </w:pPr>
             <w:r>
               <w:rPr>
-                <w:rFonts w:ascii="Arial" w:cs="Arial" w:eastAsia="Arial" w:hAnsi="Arial"/>
+                <w:rFonts w:ascii="Calibri" w:cs="Calibri" w:eastAsia="Calibri" w:hAnsi="Calibri"/>
               </w:rPr>
               <w:t xml:space="preserve">Hoja de estilos (css/styles.css), header de las 9 páginas, página de inicio y los archivos js/catalogo.js y js/carrito.js (botón "+", aviso flotante y animación del contador). No cambia la lógica del carrito ni del checkout, ni los textos legales. Se respeta la regla de la cátedra: CSS escrito a mano y JavaScript puro, sin plantillas ni librerías.</w:t>
             </w:r>
@@ -5390,7 +5429,7 @@
             </w:pPr>
             <w:r>
               <w:rPr>
-                <w:rFonts w:ascii="Arial" w:cs="Arial" w:eastAsia="Arial" w:hAnsi="Arial"/>
+                <w:rFonts w:ascii="Calibri" w:cs="Calibri" w:eastAsia="Calibri" w:hAnsi="Calibri"/>
                 <w:b/>
                 <w:bCs/>
               </w:rPr>
@@ -5421,7 +5460,7 @@
             </w:pPr>
             <w:r>
               <w:rPr>
-                <w:rFonts w:ascii="Arial" w:cs="Arial" w:eastAsia="Arial" w:hAnsi="Arial"/>
+                <w:rFonts w:ascii="Calibri" w:cs="Calibri" w:eastAsia="Calibri" w:hAnsi="Calibri"/>
               </w:rPr>
               <w:t xml:space="preserve">+ 4 hs estimadas ($ 10.000 simulados), absorbidas el 22/10 sin mover la fecha de entrega del 23/10.</w:t>
             </w:r>
@@ -5456,7 +5495,7 @@
             </w:pPr>
             <w:r>
               <w:rPr>
-                <w:rFonts w:ascii="Arial" w:cs="Arial" w:eastAsia="Arial" w:hAnsi="Arial"/>
+                <w:rFonts w:ascii="Calibri" w:cs="Calibri" w:eastAsia="Calibri" w:hAnsi="Calibri"/>
                 <w:b/>
                 <w:bCs/>
               </w:rPr>
@@ -5487,7 +5526,7 @@
             </w:pPr>
             <w:r>
               <w:rPr>
-                <w:rFonts w:ascii="Arial" w:cs="Arial" w:eastAsia="Arial" w:hAnsi="Arial"/>
+                <w:rFonts w:ascii="Calibri" w:cs="Calibri" w:eastAsia="Calibri" w:hAnsi="Calibri"/>
               </w:rPr>
               <w:t xml:space="preserve">Regresiones en funcionalidades ya aprobadas (carrito, checkout y diseño responsive) y sobrecarga en la última semana. Se mitigó desarrollándolo en una rama propia (issue #75, Pull Request #80) y re-ejecutando el plan de pruebas completo: 62 casos aprobados y 1 pendiente, sin regresiones. Las animaciones respetan la preferencia de "reducir movimiento" del sistema operativo (accesibilidad).</w:t>
             </w:r>
@@ -5522,7 +5561,7 @@
             </w:pPr>
             <w:r>
               <w:rPr>
-                <w:rFonts w:ascii="Arial" w:cs="Arial" w:eastAsia="Arial" w:hAnsi="Arial"/>
+                <w:rFonts w:ascii="Calibri" w:cs="Calibri" w:eastAsia="Calibri" w:hAnsi="Calibri"/>
                 <w:b/>
                 <w:bCs/>
               </w:rPr>
@@ -5553,7 +5592,7 @@
             </w:pPr>
             <w:r>
               <w:rPr>
-                <w:rFonts w:ascii="Arial" w:cs="Arial" w:eastAsia="Arial" w:hAnsi="Arial"/>
+                <w:rFonts w:ascii="Calibri" w:cs="Calibri" w:eastAsia="Calibri" w:hAnsi="Calibri"/>
               </w:rPr>
               <w:t xml:space="preserve">Aprobado por la PM: es una decisión de diseño que no modifica el alcance de los entregables ni la fecha de entrega (matriz de autoridad, sección 2.2). Cumple el criterio de aprobación de la sección 2.1, porque al reprogramarlo las funcionalidades obligatorias del sprint ya estaban terminadas y probadas. Se informa al docente en la revisión semanal.</w:t>
             </w:r>
@@ -5588,7 +5627,7 @@
             </w:pPr>
             <w:r>
               <w:rPr>
-                <w:rFonts w:ascii="Arial" w:cs="Arial" w:eastAsia="Arial" w:hAnsi="Arial"/>
+                <w:rFonts w:ascii="Calibri" w:cs="Calibri" w:eastAsia="Calibri" w:hAnsi="Calibri"/>
                 <w:b/>
                 <w:bCs/>
               </w:rPr>
@@ -5619,7 +5658,7 @@
             </w:pPr>
             <w:r>
               <w:rPr>
-                <w:rFonts w:ascii="Arial" w:cs="Arial" w:eastAsia="Arial" w:hAnsi="Arial"/>
+                <w:rFonts w:ascii="Calibri" w:cs="Calibri" w:eastAsia="Calibri" w:hAnsi="Calibri"/>
               </w:rPr>
               <w:t xml:space="preserve">No hizo falta postergar otras tareas. Las horas que el cambio tenía reservadas en el Sprint 4 quedan libres para el despliegue y la preparación del Pitch.</w:t>
             </w:r>
@@ -5638,7 +5677,7 @@
       </w:pPr>
       <w:r>
         <w:rPr>
-          <w:rFonts w:ascii="Arial" w:cs="Arial" w:eastAsia="Arial" w:hAnsi="Arial"/>
+          <w:rFonts w:ascii="Georgia" w:cs="Georgia" w:eastAsia="Georgia" w:hAnsi="Georgia"/>
         </w:rPr>
         <w:t xml:space="preserve">6. IMPACTO ACUMULADO SOBRE EL CRONOGRAMA</w:t>
       </w:r>
@@ -5688,7 +5727,7 @@
             </w:pPr>
             <w:r>
               <w:rPr>
-                <w:rFonts w:ascii="Arial" w:cs="Arial" w:eastAsia="Arial" w:hAnsi="Arial"/>
+                <w:rFonts w:ascii="Calibri" w:cs="Calibri" w:eastAsia="Calibri" w:hAnsi="Calibri"/>
                 <w:b/>
                 <w:bCs/>
               </w:rPr>
@@ -5720,7 +5759,7 @@
             </w:pPr>
             <w:r>
               <w:rPr>
-                <w:rFonts w:ascii="Arial" w:cs="Arial" w:eastAsia="Arial" w:hAnsi="Arial"/>
+                <w:rFonts w:ascii="Calibri" w:cs="Calibri" w:eastAsia="Calibri" w:hAnsi="Calibri"/>
                 <w:b/>
                 <w:bCs/>
               </w:rPr>
@@ -5752,7 +5791,7 @@
             </w:pPr>
             <w:r>
               <w:rPr>
-                <w:rFonts w:ascii="Arial" w:cs="Arial" w:eastAsia="Arial" w:hAnsi="Arial"/>
+                <w:rFonts w:ascii="Calibri" w:cs="Calibri" w:eastAsia="Calibri" w:hAnsi="Calibri"/>
                 <w:b/>
                 <w:bCs/>
               </w:rPr>
@@ -5788,7 +5827,7 @@
             </w:pPr>
             <w:r>
               <w:rPr>
-                <w:rFonts w:ascii="Arial" w:cs="Arial" w:eastAsia="Arial" w:hAnsi="Arial"/>
+                <w:rFonts w:ascii="Calibri" w:cs="Calibri" w:eastAsia="Calibri" w:hAnsi="Calibri"/>
               </w:rPr>
               <w:t xml:space="preserve">Cambios aprobados con horas adicionales (CR-02 y CR-05)</w:t>
             </w:r>
@@ -5817,7 +5856,7 @@
             </w:pPr>
             <w:r>
               <w:rPr>
-                <w:rFonts w:ascii="Arial" w:cs="Arial" w:eastAsia="Arial" w:hAnsi="Arial"/>
+                <w:rFonts w:ascii="Calibri" w:cs="Calibri" w:eastAsia="Calibri" w:hAnsi="Calibri"/>
               </w:rPr>
               <w:t xml:space="preserve">+ 9 hs</w:t>
             </w:r>
@@ -5846,7 +5885,7 @@
             </w:pPr>
             <w:r>
               <w:rPr>
-                <w:rFonts w:ascii="Arial" w:cs="Arial" w:eastAsia="Arial" w:hAnsi="Arial"/>
+                <w:rFonts w:ascii="Calibri" w:cs="Calibri" w:eastAsia="Calibri" w:hAnsi="Calibri"/>
               </w:rPr>
               <w:t xml:space="preserve">CR-02 en las semanas 8 y 9; CR-05 el 22/10</w:t>
             </w:r>
@@ -5880,7 +5919,7 @@
             </w:pPr>
             <w:r>
               <w:rPr>
-                <w:rFonts w:ascii="Arial" w:cs="Arial" w:eastAsia="Arial" w:hAnsi="Arial"/>
+                <w:rFonts w:ascii="Calibri" w:cs="Calibri" w:eastAsia="Calibri" w:hAnsi="Calibri"/>
               </w:rPr>
               <w:t xml:space="preserve">Cambios aprobados sin horas adicionales (CR-01, CR-03)</w:t>
             </w:r>
@@ -5909,7 +5948,7 @@
             </w:pPr>
             <w:r>
               <w:rPr>
-                <w:rFonts w:ascii="Arial" w:cs="Arial" w:eastAsia="Arial" w:hAnsi="Arial"/>
+                <w:rFonts w:ascii="Calibri" w:cs="Calibri" w:eastAsia="Calibri" w:hAnsi="Calibri"/>
               </w:rPr>
               <w:t xml:space="preserve">0 hs</w:t>
             </w:r>
@@ -5938,7 +5977,7 @@
             </w:pPr>
             <w:r>
               <w:rPr>
-                <w:rFonts w:ascii="Arial" w:cs="Arial" w:eastAsia="Arial" w:hAnsi="Arial"/>
+                <w:rFonts w:ascii="Calibri" w:cs="Calibri" w:eastAsia="Calibri" w:hAnsi="Calibri"/>
               </w:rPr>
               <w:t xml:space="preserve">CR-01 reduce el esfuerzo previsto</w:t>
             </w:r>
@@ -5972,7 +6011,7 @@
             </w:pPr>
             <w:r>
               <w:rPr>
-                <w:rFonts w:ascii="Arial" w:cs="Arial" w:eastAsia="Arial" w:hAnsi="Arial"/>
+                <w:rFonts w:ascii="Calibri" w:cs="Calibri" w:eastAsia="Calibri" w:hAnsi="Calibri"/>
               </w:rPr>
               <w:t xml:space="preserve">Cambios diferidos (CR-04)</w:t>
             </w:r>
@@ -6001,7 +6040,7 @@
             </w:pPr>
             <w:r>
               <w:rPr>
-                <w:rFonts w:ascii="Arial" w:cs="Arial" w:eastAsia="Arial" w:hAnsi="Arial"/>
+                <w:rFonts w:ascii="Calibri" w:cs="Calibri" w:eastAsia="Calibri" w:hAnsi="Calibri"/>
               </w:rPr>
               <w:t xml:space="preserve">+ 5 hs evitadas</w:t>
             </w:r>
@@ -6030,7 +6069,7 @@
             </w:pPr>
             <w:r>
               <w:rPr>
-                <w:rFonts w:ascii="Arial" w:cs="Arial" w:eastAsia="Arial" w:hAnsi="Arial"/>
+                <w:rFonts w:ascii="Calibri" w:cs="Calibri" w:eastAsia="Calibri" w:hAnsi="Calibri"/>
               </w:rPr>
               <w:t xml:space="preserve">Pasan al Sprint 4</w:t>
             </w:r>
@@ -6064,7 +6103,7 @@
             </w:pPr>
             <w:r>
               <w:rPr>
-                <w:rFonts w:ascii="Arial" w:cs="Arial" w:eastAsia="Arial" w:hAnsi="Arial"/>
+                <w:rFonts w:ascii="Calibri" w:cs="Calibri" w:eastAsia="Calibri" w:hAnsi="Calibri"/>
                 <w:b/>
                 <w:bCs/>
               </w:rPr>
@@ -6095,7 +6134,7 @@
             </w:pPr>
             <w:r>
               <w:rPr>
-                <w:rFonts w:ascii="Arial" w:cs="Arial" w:eastAsia="Arial" w:hAnsi="Arial"/>
+                <w:rFonts w:ascii="Calibri" w:cs="Calibri" w:eastAsia="Calibri" w:hAnsi="Calibri"/>
                 <w:b/>
                 <w:bCs/>
               </w:rPr>
@@ -6126,7 +6165,7 @@
             </w:pPr>
             <w:r>
               <w:rPr>
-                <w:rFonts w:ascii="Arial" w:cs="Arial" w:eastAsia="Arial" w:hAnsi="Arial"/>
+                <w:rFonts w:ascii="Calibri" w:cs="Calibri" w:eastAsia="Calibri" w:hAnsi="Calibri"/>
               </w:rPr>
               <w:t xml:space="preserve">La entrega se mantiene</w:t>
             </w:r>
@@ -6146,7 +6185,7 @@
       </w:pPr>
       <w:r>
         <w:rPr>
-          <w:rFonts w:ascii="Arial" w:cs="Arial" w:eastAsia="Arial" w:hAnsi="Arial"/>
+          <w:rFonts w:ascii="Calibri" w:cs="Calibri" w:eastAsia="Calibri" w:hAnsi="Calibri"/>
           <w:b/>
           <w:bCs/>
         </w:rPr>
@@ -6154,7 +6193,7 @@
       </w:r>
       <w:r>
         <w:rPr>
-          <w:rFonts w:ascii="Arial" w:cs="Arial" w:eastAsia="Arial" w:hAnsi="Arial"/>
+          <w:rFonts w:ascii="Calibri" w:cs="Calibri" w:eastAsia="Calibri" w:hAnsi="Calibri"/>
         </w:rPr>
         <w:t xml:space="preserve"> Se aprobaron los cambios obligatorios o de impacto bajo y se difirió el que ponía en riesgo la fecha (CR-04). El rediseño visual (CR-05) se adelantó del Sprint 4 cuando las funcionalidades obligatorias ya estaban terminadas y probadas, por lo que no comprometió la entrega. El alcance del Sprint 3 queda controlado y la entrega del 23/10 se mantiene.</w:t>
       </w:r>
@@ -6220,8 +6259,8 @@
     </w:pPr>
     <w:r>
       <w:rPr>
-        <w:rFonts w:ascii="Arial" w:cs="Arial" w:eastAsia="Arial" w:hAnsi="Arial"/>
-        <w:color w:val="7F7F7F"/>
+        <w:rFonts w:ascii="Calibri" w:cs="Calibri" w:eastAsia="Calibri" w:hAnsi="Calibri"/>
+        <w:color w:val="8A5A00"/>
         <w:sz w:val="16"/>
         <w:szCs w:val="16"/>
       </w:rPr>
@@ -6229,8 +6268,8 @@
     </w:r>
     <w:r>
       <w:rPr>
-        <w:rFonts w:ascii="Arial" w:cs="Arial" w:eastAsia="Arial" w:hAnsi="Arial"/>
-        <w:color w:val="7F7F7F"/>
+        <w:rFonts w:ascii="Calibri" w:cs="Calibri" w:eastAsia="Calibri" w:hAnsi="Calibri"/>
+        <w:color w:val="8A5A00"/>
         <w:sz w:val="16"/>
         <w:szCs w:val="16"/>
       </w:rPr>
@@ -6241,8 +6280,8 @@
     </w:r>
     <w:r>
       <w:rPr>
-        <w:rFonts w:ascii="Arial" w:cs="Arial" w:eastAsia="Arial" w:hAnsi="Arial"/>
-        <w:color w:val="7F7F7F"/>
+        <w:rFonts w:ascii="Calibri" w:cs="Calibri" w:eastAsia="Calibri" w:hAnsi="Calibri"/>
+        <w:color w:val="8A5A00"/>
         <w:sz w:val="16"/>
         <w:szCs w:val="16"/>
       </w:rPr>
@@ -6250,8 +6289,8 @@
     </w:r>
     <w:r>
       <w:rPr>
-        <w:rFonts w:ascii="Arial" w:cs="Arial" w:eastAsia="Arial" w:hAnsi="Arial"/>
-        <w:color w:val="7F7F7F"/>
+        <w:rFonts w:ascii="Calibri" w:cs="Calibri" w:eastAsia="Calibri" w:hAnsi="Calibri"/>
+        <w:color w:val="8A5A00"/>
         <w:sz w:val="16"/>
         <w:szCs w:val="16"/>
       </w:rPr>
@@ -6306,14 +6345,14 @@
   <w:p>
     <w:pPr>
       <w:pBdr>
-        <w:bottom w:val="single" w:color="BFBFBF" w:sz="4" w:space="4"/>
+        <w:bottom w:val="single" w:color="D69E2E" w:sz="8" w:space="4"/>
       </w:pBdr>
       <w:jc w:val="right"/>
     </w:pPr>
     <w:r>
       <w:rPr>
-        <w:rFonts w:ascii="Arial" w:cs="Arial" w:eastAsia="Arial" w:hAnsi="Arial"/>
-        <w:color w:val="7F7F7F"/>
+        <w:rFonts w:ascii="Calibri" w:cs="Calibri" w:eastAsia="Calibri" w:hAnsi="Calibri"/>
+        <w:color w:val="8A5A00"/>
         <w:sz w:val="16"/>
         <w:szCs w:val="16"/>
       </w:rPr>
@@ -6459,9 +6498,9 @@
   <w:docDefaults>
     <w:rPrDefault>
       <w:rPr>
-        <w:rFonts w:ascii="Arial" w:cs="Arial" w:eastAsia="Arial" w:hAnsi="Arial"/>
-        <w:sz w:val="21"/>
-        <w:szCs w:val="21"/>
+        <w:rFonts w:ascii="Calibri" w:cs="Calibri" w:eastAsia="Calibri" w:hAnsi="Calibri"/>
+        <w:sz w:val="22"/>
+        <w:szCs w:val="22"/>
       </w:rPr>
     </w:rPrDefault>
     <w:pPrDefault/>
@@ -6472,6 +6511,9 @@
     <w:next w:val="Normal"/>
     <w:qFormat/>
     <w:rPr>
+      <w:rFonts w:ascii="Georgia" w:cs="Georgia" w:eastAsia="Georgia" w:hAnsi="Georgia"/>
+      <w:b/>
+      <w:bCs/>
       <w:sz w:val="56"/>
       <w:szCs w:val="56"/>
     </w:rPr>
@@ -6482,7 +6524,10 @@
     <w:next w:val="Normal"/>
     <w:qFormat/>
     <w:rPr>
-      <w:color w:val="2E74B5"/>
+      <w:rFonts w:ascii="Georgia" w:cs="Georgia" w:eastAsia="Georgia" w:hAnsi="Georgia"/>
+      <w:b/>
+      <w:bCs/>
+      <w:color w:val="8A5A00"/>
       <w:sz w:val="32"/>
       <w:szCs w:val="32"/>
     </w:rPr>
@@ -6493,7 +6538,10 @@
     <w:next w:val="Normal"/>
     <w:qFormat/>
     <w:rPr>
-      <w:color w:val="2E74B5"/>
+      <w:rFonts w:ascii="Georgia" w:cs="Georgia" w:eastAsia="Georgia" w:hAnsi="Georgia"/>
+      <w:b/>
+      <w:bCs/>
+      <w:color w:val="8A5A00"/>
       <w:sz w:val="26"/>
       <w:szCs w:val="26"/>
     </w:rPr>
@@ -6504,7 +6552,10 @@
     <w:next w:val="Normal"/>
     <w:qFormat/>
     <w:rPr>
-      <w:color w:val="1F4D78"/>
+      <w:rFonts w:ascii="Georgia" w:cs="Georgia" w:eastAsia="Georgia" w:hAnsi="Georgia"/>
+      <w:b/>
+      <w:bCs/>
+      <w:color w:val="8A5A00"/>
       <w:sz w:val="24"/>
       <w:szCs w:val="24"/>
     </w:rPr>
@@ -6515,9 +6566,12 @@
     <w:next w:val="Normal"/>
     <w:qFormat/>
     <w:rPr>
+      <w:rFonts w:ascii="Georgia" w:cs="Georgia" w:eastAsia="Georgia" w:hAnsi="Georgia"/>
+      <w:b/>
+      <w:bCs/>
       <w:i/>
       <w:iCs/>
-      <w:color w:val="2E74B5"/>
+      <w:color w:val="8A5A00"/>
     </w:rPr>
   </w:style>
   <w:style w:type="paragraph" w:styleId="Heading5">
@@ -6526,7 +6580,10 @@
     <w:next w:val="Normal"/>
     <w:qFormat/>
     <w:rPr>
-      <w:color w:val="2E74B5"/>
+      <w:rFonts w:ascii="Georgia" w:cs="Georgia" w:eastAsia="Georgia" w:hAnsi="Georgia"/>
+      <w:b/>
+      <w:bCs/>
+      <w:color w:val="8A5A00"/>
     </w:rPr>
   </w:style>
   <w:style w:type="paragraph" w:styleId="Heading6">
@@ -6535,7 +6592,10 @@
     <w:next w:val="Normal"/>
     <w:qFormat/>
     <w:rPr>
-      <w:color w:val="1F4D78"/>
+      <w:rFonts w:ascii="Georgia" w:cs="Georgia" w:eastAsia="Georgia" w:hAnsi="Georgia"/>
+      <w:b/>
+      <w:bCs/>
+      <w:color w:val="8A5A00"/>
     </w:rPr>
   </w:style>
   <w:style w:type="paragraph" w:styleId="Strong">
@@ -6646,7 +6706,7 @@
       <w:outlineLvl w:val="0"/>
     </w:pPr>
     <w:rPr>
-      <w:rFonts w:ascii="Arial" w:cs="Arial" w:eastAsia="Arial" w:hAnsi="Arial"/>
+      <w:rFonts w:ascii="Calibri" w:cs="Calibri" w:eastAsia="Calibri" w:hAnsi="Calibri"/>
       <w:b/>
       <w:bCs/>
       <w:color w:val="8A5A00"/>
@@ -6663,10 +6723,10 @@
       <w:outlineLvl w:val="1"/>
     </w:pPr>
     <w:rPr>
-      <w:rFonts w:ascii="Arial" w:cs="Arial" w:eastAsia="Arial" w:hAnsi="Arial"/>
+      <w:rFonts w:ascii="Calibri" w:cs="Calibri" w:eastAsia="Calibri" w:hAnsi="Calibri"/>
       <w:b/>
       <w:bCs/>
-      <w:color w:val="3B2A00"/>
+      <w:color w:val="8A5A00"/>
       <w:sz w:val="23"/>
       <w:szCs w:val="23"/>
     </w:rPr>

</xml_diff>